<commit_message>
Add Project 2 Phase 6 security baseline and update implementation doc.
Co-authored-by: Cursor <cursoragent@cursor.com>
</commit_message>
<xml_diff>
--- a/project-2-aws-infrastructure/docs/Project 2 - What was Implemented.docx
+++ b/project-2-aws-infrastructure/docs/Project 2 - What was Implemented.docx
@@ -1,6 +1,6 @@
 
 <file path=word/document.xml><?xml version="1.0" encoding="utf-8"?>
-<w:document xmlns:wpc="http://schemas.microsoft.com/office/word/2010/wordprocessingCanvas" xmlns:cx="http://schemas.microsoft.com/office/drawing/2014/chartex" xmlns:cx1="http://schemas.microsoft.com/office/drawing/2015/9/8/chartex" xmlns:cx2="http://schemas.microsoft.com/office/drawing/2015/10/21/chartex" xmlns:cx3="http://schemas.microsoft.com/office/drawing/2016/5/9/chartex" xmlns:cx4="http://schemas.microsoft.com/office/drawing/2016/5/10/chartex" xmlns:cx5="http://schemas.microsoft.com/office/drawing/2016/5/11/chartex" xmlns:cx6="http://schemas.microsoft.com/office/drawing/2016/5/12/chartex" xmlns:cx7="http://schemas.microsoft.com/office/drawing/2016/5/13/chartex" xmlns:cx8="http://schemas.microsoft.com/office/drawing/2016/5/14/chartex" xmlns:mc="http://schemas.openxmlformats.org/markup-compatibility/2006" xmlns:aink="http://schemas.microsoft.com/office/drawing/2016/ink" xmlns:am3d="http://schemas.microsoft.com/office/drawing/2017/model3d" xmlns:o="urn:schemas-microsoft-com:office:office" xmlns:oel="http://schemas.microsoft.com/office/2019/extlst" xmlns:r="http://schemas.openxmlformats.org/officeDocument/2006/relationships" xmlns:m="http://schemas.openxmlformats.org/officeDocument/2006/math" xmlns:v="urn:schemas-microsoft-com:vml" xmlns:wp14="http://schemas.microsoft.com/office/word/2010/wordprocessingDrawing" xmlns:wp="http://schemas.openxmlformats.org/drawingml/2006/wordprocessingDrawing" xmlns:w10="urn:schemas-microsoft-com:office:word" xmlns:w="http://schemas.openxmlformats.org/wordprocessingml/2006/main" xmlns:w14="http://schemas.microsoft.com/office/word/2010/wordml" xmlns:w15="http://schemas.microsoft.com/office/word/2012/wordml" xmlns:w16cei="http://schemas.microsoft.com/office/word/2026/wordml/cei" xmlns:w16cex="http://schemas.microsoft.com/office/word/2018/wordml/cex" xmlns:w16cid="http://schemas.microsoft.com/office/word/2016/wordml/cid" xmlns:w16="http://schemas.microsoft.com/office/word/2018/wordml" xmlns:w16du="http://schemas.microsoft.com/office/word/2023/wordml/word16du" xmlns:w16sdtdh="http://schemas.microsoft.com/office/word/2020/wordml/sdtdatahash" xmlns:w16sdtfl="http://schemas.microsoft.com/office/word/2024/wordml/sdtformatlock" xmlns:w16se="http://schemas.microsoft.com/office/word/2015/wordml/symex" xmlns:wpg="http://schemas.microsoft.com/office/word/2010/wordprocessingGroup" xmlns:wpi="http://schemas.microsoft.com/office/word/2010/wordprocessingInk" xmlns:wne="http://schemas.microsoft.com/office/word/2006/wordml" xmlns:wps="http://schemas.microsoft.com/office/word/2010/wordprocessingShape" mc:Ignorable="w14 w15 w16se w16cid w16 w16cex w16sdtdh w16sdtfl w16du wp14">
+<w:document xmlns:wpc="http://schemas.microsoft.com/office/word/2010/wordprocessingCanvas" xmlns:cx="http://schemas.microsoft.com/office/drawing/2014/chartex" xmlns:cx1="http://schemas.microsoft.com/office/drawing/2015/9/8/chartex" xmlns:cx2="http://schemas.microsoft.com/office/drawing/2015/10/21/chartex" xmlns:cx3="http://schemas.microsoft.com/office/drawing/2016/5/9/chartex" xmlns:cx4="http://schemas.microsoft.com/office/drawing/2016/5/10/chartex" xmlns:cx5="http://schemas.microsoft.com/office/drawing/2016/5/11/chartex" xmlns:cx6="http://schemas.microsoft.com/office/drawing/2016/5/12/chartex" xmlns:cx7="http://schemas.microsoft.com/office/drawing/2016/5/13/chartex" xmlns:cx8="http://schemas.microsoft.com/office/drawing/2016/5/14/chartex" xmlns:mc="http://schemas.openxmlformats.org/markup-compatibility/2006" xmlns:aink="http://schemas.microsoft.com/office/drawing/2016/ink" xmlns:am3d="http://schemas.microsoft.com/office/drawing/2017/model3d" xmlns:o="urn:schemas-microsoft-com:office:office" xmlns:oel="http://schemas.microsoft.com/office/2019/extlst" xmlns:r="http://schemas.openxmlformats.org/officeDocument/2006/relationships" xmlns:m="http://schemas.openxmlformats.org/officeDocument/2006/math" xmlns:v="urn:schemas-microsoft-com:vml" xmlns:wp14="http://schemas.microsoft.com/office/word/2010/wordprocessingDrawing" xmlns:wp="http://schemas.openxmlformats.org/drawingml/2006/wordprocessingDrawing" xmlns:w10="urn:schemas-microsoft-com:office:word" xmlns:w="http://schemas.openxmlformats.org/wordprocessingml/2006/main" xmlns:w14="http://schemas.microsoft.com/office/word/2010/wordml" xmlns:w15="http://schemas.microsoft.com/office/word/2012/wordml" xmlns:w16cex="http://schemas.microsoft.com/office/word/2018/wordml/cex" xmlns:w16cid="http://schemas.microsoft.com/office/word/2016/wordml/cid" xmlns:w16="http://schemas.microsoft.com/office/word/2018/wordml" xmlns:w16du="http://schemas.microsoft.com/office/word/2023/wordml/word16du" xmlns:w16sdtdh="http://schemas.microsoft.com/office/word/2020/wordml/sdtdatahash" xmlns:w16sdtfl="http://schemas.microsoft.com/office/word/2024/wordml/sdtformatlock" xmlns:w16se="http://schemas.microsoft.com/office/word/2015/wordml/symex" xmlns:wpg="http://schemas.microsoft.com/office/word/2010/wordprocessingGroup" xmlns:wpi="http://schemas.microsoft.com/office/word/2010/wordprocessingInk" xmlns:wne="http://schemas.microsoft.com/office/word/2006/wordml" xmlns:wps="http://schemas.microsoft.com/office/word/2010/wordprocessingShape" mc:Ignorable="w14 w15 w16se w16cid w16 w16cex w16sdtdh w16sdtfl w16du wp14">
   <w:body>
     <w:p>
       <w:pPr>
@@ -26,6 +26,14 @@
     </w:p>
     <w:sdt>
       <w:sdtPr>
+        <w:rPr>
+          <w:rFonts w:asciiTheme="minorHAnsi" w:eastAsiaTheme="minorHAnsi" w:hAnsiTheme="minorHAnsi" w:cstheme="minorBidi"/>
+          <w:color w:val="auto"/>
+          <w:kern w:val="2"/>
+          <w:sz w:val="24"/>
+          <w:szCs w:val="24"/>
+          <w14:ligatures w14:val="standardContextual"/>
+        </w:rPr>
         <w:id w:val="-1308701538"/>
         <w:docPartObj>
           <w:docPartGallery w:val="Table of Contents"/>
@@ -34,15 +42,9 @@
       </w:sdtPr>
       <w:sdtEndPr>
         <w:rPr>
-          <w:rFonts w:asciiTheme="minorHAnsi" w:eastAsiaTheme="minorHAnsi" w:hAnsiTheme="minorHAnsi" w:cstheme="minorBidi"/>
           <w:b/>
           <w:bCs/>
           <w:noProof/>
-          <w:color w:val="auto"/>
-          <w:kern w:val="2"/>
-          <w:sz w:val="24"/>
-          <w:szCs w:val="24"/>
-          <w14:ligatures w14:val="standardContextual"/>
         </w:rPr>
       </w:sdtEndPr>
       <w:sdtContent>
@@ -74,7 +76,7 @@
           <w:r>
             <w:fldChar w:fldCharType="separate"/>
           </w:r>
-          <w:hyperlink w:anchor="_Toc236411359" w:history="1">
+          <w:hyperlink w:anchor="_Toc238685605" w:history="1">
             <w:r>
               <w:rPr>
                 <w:rStyle w:val="Hyperlink"/>
@@ -101,7 +103,7 @@
                 <w:noProof/>
                 <w:webHidden/>
               </w:rPr>
-              <w:instrText xml:space="preserve"> PAGEREF _Toc236411359 \h </w:instrText>
+              <w:instrText xml:space="preserve"> PAGEREF _Toc238685605 \h </w:instrText>
             </w:r>
             <w:r>
               <w:rPr>
@@ -143,7 +145,7 @@
               <w:noProof/>
             </w:rPr>
           </w:pPr>
-          <w:hyperlink w:anchor="_Toc236411360" w:history="1">
+          <w:hyperlink w:anchor="_Toc238685606" w:history="1">
             <w:r>
               <w:rPr>
                 <w:rStyle w:val="Hyperlink"/>
@@ -170,7 +172,7 @@
                 <w:noProof/>
                 <w:webHidden/>
               </w:rPr>
-              <w:instrText xml:space="preserve"> PAGEREF _Toc236411360 \h </w:instrText>
+              <w:instrText xml:space="preserve"> PAGEREF _Toc238685606 \h </w:instrText>
             </w:r>
             <w:r>
               <w:rPr>
@@ -212,7 +214,7 @@
               <w:noProof/>
             </w:rPr>
           </w:pPr>
-          <w:hyperlink w:anchor="_Toc236411361" w:history="1">
+          <w:hyperlink w:anchor="_Toc238685607" w:history="1">
             <w:r>
               <w:rPr>
                 <w:rStyle w:val="Hyperlink"/>
@@ -239,7 +241,7 @@
                 <w:noProof/>
                 <w:webHidden/>
               </w:rPr>
-              <w:instrText xml:space="preserve"> PAGEREF _Toc236411361 \h </w:instrText>
+              <w:instrText xml:space="preserve"> PAGEREF _Toc238685607 \h </w:instrText>
             </w:r>
             <w:r>
               <w:rPr>
@@ -281,7 +283,7 @@
               <w:noProof/>
             </w:rPr>
           </w:pPr>
-          <w:hyperlink w:anchor="_Toc236411362" w:history="1">
+          <w:hyperlink w:anchor="_Toc238685608" w:history="1">
             <w:r>
               <w:rPr>
                 <w:rStyle w:val="Hyperlink"/>
@@ -308,7 +310,7 @@
                 <w:noProof/>
                 <w:webHidden/>
               </w:rPr>
-              <w:instrText xml:space="preserve"> PAGEREF _Toc236411362 \h </w:instrText>
+              <w:instrText xml:space="preserve"> PAGEREF _Toc238685608 \h </w:instrText>
             </w:r>
             <w:r>
               <w:rPr>
@@ -350,7 +352,7 @@
               <w:noProof/>
             </w:rPr>
           </w:pPr>
-          <w:hyperlink w:anchor="_Toc236411363" w:history="1">
+          <w:hyperlink w:anchor="_Toc238685609" w:history="1">
             <w:r>
               <w:rPr>
                 <w:rStyle w:val="Hyperlink"/>
@@ -377,7 +379,7 @@
                 <w:noProof/>
                 <w:webHidden/>
               </w:rPr>
-              <w:instrText xml:space="preserve"> PAGEREF _Toc236411363 \h </w:instrText>
+              <w:instrText xml:space="preserve"> PAGEREF _Toc238685609 \h </w:instrText>
             </w:r>
             <w:r>
               <w:rPr>
@@ -419,7 +421,7 @@
               <w:noProof/>
             </w:rPr>
           </w:pPr>
-          <w:hyperlink w:anchor="_Toc236411364" w:history="1">
+          <w:hyperlink w:anchor="_Toc238685610" w:history="1">
             <w:r>
               <w:rPr>
                 <w:rStyle w:val="Hyperlink"/>
@@ -446,7 +448,76 @@
                 <w:noProof/>
                 <w:webHidden/>
               </w:rPr>
-              <w:instrText xml:space="preserve"> PAGEREF _Toc236411364 \h </w:instrText>
+              <w:instrText xml:space="preserve"> PAGEREF _Toc238685610 \h </w:instrText>
+            </w:r>
+            <w:r>
+              <w:rPr>
+                <w:noProof/>
+                <w:webHidden/>
+              </w:rPr>
+            </w:r>
+            <w:r>
+              <w:rPr>
+                <w:noProof/>
+                <w:webHidden/>
+              </w:rPr>
+              <w:fldChar w:fldCharType="separate"/>
+            </w:r>
+            <w:r>
+              <w:rPr>
+                <w:noProof/>
+                <w:webHidden/>
+              </w:rPr>
+              <w:t>2</w:t>
+            </w:r>
+            <w:r>
+              <w:rPr>
+                <w:noProof/>
+                <w:webHidden/>
+              </w:rPr>
+              <w:fldChar w:fldCharType="end"/>
+            </w:r>
+          </w:hyperlink>
+        </w:p>
+        <w:p>
+          <w:pPr>
+            <w:pStyle w:val="TOC1"/>
+            <w:tabs>
+              <w:tab w:val="right" w:leader="dot" w:pos="9350"/>
+            </w:tabs>
+            <w:rPr>
+              <w:rFonts w:eastAsiaTheme="minorEastAsia"/>
+              <w:noProof/>
+            </w:rPr>
+          </w:pPr>
+          <w:hyperlink w:anchor="_Toc238685611" w:history="1">
+            <w:r>
+              <w:rPr>
+                <w:rStyle w:val="Hyperlink"/>
+                <w:noProof/>
+              </w:rPr>
+              <w:t>Phase 6: Security Baseline</w:t>
+            </w:r>
+            <w:r>
+              <w:rPr>
+                <w:noProof/>
+                <w:webHidden/>
+              </w:rPr>
+              <w:tab/>
+            </w:r>
+            <w:r>
+              <w:rPr>
+                <w:noProof/>
+                <w:webHidden/>
+              </w:rPr>
+              <w:fldChar w:fldCharType="begin"/>
+            </w:r>
+            <w:r>
+              <w:rPr>
+                <w:noProof/>
+                <w:webHidden/>
+              </w:rPr>
+              <w:instrText xml:space="preserve"> PAGEREF _Toc238685611 \h </w:instrText>
             </w:r>
             <w:r>
               <w:rPr>
@@ -497,7 +568,7 @@
           <w:szCs w:val="30"/>
         </w:rPr>
       </w:pPr>
-      <w:bookmarkStart w:id="0" w:name="_Toc236411359"/>
+      <w:bookmarkStart w:id="0" w:name="_Toc238685605"/>
       <w:r>
         <w:rPr>
           <w:sz w:val="30"/>
@@ -520,7 +591,7 @@
           <w:szCs w:val="30"/>
         </w:rPr>
       </w:pPr>
-      <w:bookmarkStart w:id="1" w:name="_Toc236411360"/>
+      <w:bookmarkStart w:id="1" w:name="_Toc238685606"/>
       <w:r>
         <w:rPr>
           <w:sz w:val="30"/>
@@ -611,7 +682,7 @@
           <w:szCs w:val="30"/>
         </w:rPr>
       </w:pPr>
-      <w:bookmarkStart w:id="2" w:name="_Toc236411361"/>
+      <w:bookmarkStart w:id="2" w:name="_Toc238685607"/>
       <w:r>
         <w:rPr>
           <w:sz w:val="30"/>
@@ -711,7 +782,7 @@
           <w:szCs w:val="30"/>
         </w:rPr>
       </w:pPr>
-      <w:bookmarkStart w:id="3" w:name="_Toc236411362"/>
+      <w:bookmarkStart w:id="3" w:name="_Toc238685608"/>
       <w:r>
         <w:rPr>
           <w:sz w:val="30"/>
@@ -792,7 +863,7 @@
           <w:szCs w:val="30"/>
         </w:rPr>
       </w:pPr>
-      <w:bookmarkStart w:id="4" w:name="_Toc236411363"/>
+      <w:bookmarkStart w:id="4" w:name="_Toc238685609"/>
       <w:r>
         <w:rPr>
           <w:sz w:val="30"/>
@@ -915,7 +986,7 @@
           <w:szCs w:val="30"/>
         </w:rPr>
       </w:pPr>
-      <w:bookmarkStart w:id="5" w:name="_Toc236411364"/>
+      <w:bookmarkStart w:id="5" w:name="_Toc238685610"/>
       <w:r>
         <w:rPr>
           <w:sz w:val="30"/>
@@ -952,6 +1023,599 @@
         <w:t>Team-ready state management separate from the deployable lab stack</w:t>
       </w:r>
     </w:p>
+    <w:p>
+      <w:pPr>
+        <w:pStyle w:val="ListParagraph"/>
+      </w:pPr>
+    </w:p>
+    <w:p>
+      <w:pPr>
+        <w:pStyle w:val="Heading1"/>
+        <w:rPr>
+          <w:sz w:val="30"/>
+          <w:szCs w:val="30"/>
+        </w:rPr>
+      </w:pPr>
+      <w:bookmarkStart w:id="6" w:name="_Toc238685611"/>
+      <w:r>
+        <w:rPr>
+          <w:sz w:val="30"/>
+          <w:szCs w:val="30"/>
+        </w:rPr>
+        <w:t>Phase 6</w:t>
+      </w:r>
+      <w:r>
+        <w:rPr>
+          <w:sz w:val="30"/>
+          <w:szCs w:val="30"/>
+        </w:rPr>
+        <w:t>: Security Baseline</w:t>
+      </w:r>
+      <w:bookmarkEnd w:id="6"/>
+    </w:p>
+    <w:p>
+      <w:pPr>
+        <w:rPr>
+          <w:b/>
+          <w:bCs/>
+        </w:rPr>
+      </w:pPr>
+      <w:r>
+        <w:rPr>
+          <w:b/>
+          <w:bCs/>
+        </w:rPr>
+        <w:t>KMS encryption</w:t>
+      </w:r>
+    </w:p>
+    <w:p>
+      <w:pPr>
+        <w:numPr>
+          <w:ilvl w:val="0"/>
+          <w:numId w:val="10"/>
+        </w:numPr>
+      </w:pPr>
+      <w:r>
+        <w:t>Customer-managed KMS key with automatic rotation enabled</w:t>
+      </w:r>
+    </w:p>
+    <w:p>
+      <w:pPr>
+        <w:numPr>
+          <w:ilvl w:val="0"/>
+          <w:numId w:val="10"/>
+        </w:numPr>
+      </w:pPr>
+      <w:r>
+        <w:t>KMS alias for security logs</w:t>
+      </w:r>
+    </w:p>
+    <w:p>
+      <w:pPr>
+        <w:numPr>
+          <w:ilvl w:val="0"/>
+          <w:numId w:val="10"/>
+        </w:numPr>
+      </w:pPr>
+      <w:r>
+        <w:t>Key policy allowing CloudTrail and AWS Config to encrypt/decrypt log data</w:t>
+      </w:r>
+    </w:p>
+    <w:p>
+      <w:pPr>
+        <w:rPr>
+          <w:b/>
+          <w:bCs/>
+        </w:rPr>
+      </w:pPr>
+      <w:r>
+        <w:rPr>
+          <w:b/>
+          <w:bCs/>
+        </w:rPr>
+        <w:t>Security log storage (S3)</w:t>
+      </w:r>
+    </w:p>
+    <w:p>
+      <w:pPr>
+        <w:numPr>
+          <w:ilvl w:val="0"/>
+          <w:numId w:val="11"/>
+        </w:numPr>
+      </w:pPr>
+      <w:r>
+        <w:t>Private S3 bucket for CloudTrail and AWS Config delivery</w:t>
+      </w:r>
+    </w:p>
+    <w:p>
+      <w:pPr>
+        <w:numPr>
+          <w:ilvl w:val="0"/>
+          <w:numId w:val="11"/>
+        </w:numPr>
+      </w:pPr>
+      <w:r>
+        <w:t>Block Public Access enabled</w:t>
+      </w:r>
+    </w:p>
+    <w:p>
+      <w:pPr>
+        <w:numPr>
+          <w:ilvl w:val="0"/>
+          <w:numId w:val="11"/>
+        </w:numPr>
+      </w:pPr>
+      <w:r>
+        <w:t>Versioning enabled</w:t>
+      </w:r>
+    </w:p>
+    <w:p>
+      <w:pPr>
+        <w:numPr>
+          <w:ilvl w:val="0"/>
+          <w:numId w:val="11"/>
+        </w:numPr>
+      </w:pPr>
+      <w:r>
+        <w:t>Server-side encryption using the customer-managed KMS key</w:t>
+      </w:r>
+    </w:p>
+    <w:p>
+      <w:pPr>
+        <w:numPr>
+          <w:ilvl w:val="0"/>
+          <w:numId w:val="11"/>
+        </w:numPr>
+      </w:pPr>
+      <w:r>
+        <w:t>Lifecycle rules (30-day object expiration; 7-day noncurrent version expiration)</w:t>
+      </w:r>
+    </w:p>
+    <w:p>
+      <w:pPr>
+        <w:numPr>
+          <w:ilvl w:val="0"/>
+          <w:numId w:val="11"/>
+        </w:numPr>
+      </w:pPr>
+      <w:r>
+        <w:t>Bucket policy granting CloudTrail/Config write access</w:t>
+      </w:r>
+    </w:p>
+    <w:p>
+      <w:pPr>
+        <w:numPr>
+          <w:ilvl w:val="0"/>
+          <w:numId w:val="11"/>
+        </w:numPr>
+      </w:pPr>
+      <w:r>
+        <w:lastRenderedPageBreak/>
+        <w:t>Deny insecure transport (HTTPS-only) policy</w:t>
+      </w:r>
+    </w:p>
+    <w:p>
+      <w:pPr>
+        <w:rPr>
+          <w:b/>
+          <w:bCs/>
+        </w:rPr>
+      </w:pPr>
+      <w:r>
+        <w:rPr>
+          <w:b/>
+          <w:bCs/>
+        </w:rPr>
+        <w:t>CloudTrail</w:t>
+      </w:r>
+    </w:p>
+    <w:p>
+      <w:pPr>
+        <w:numPr>
+          <w:ilvl w:val="0"/>
+          <w:numId w:val="12"/>
+        </w:numPr>
+      </w:pPr>
+      <w:r>
+        <w:t xml:space="preserve">Multi-region </w:t>
+      </w:r>
+      <w:proofErr w:type="gramStart"/>
+      <w:r>
+        <w:t>trail</w:t>
+      </w:r>
+      <w:proofErr w:type="gramEnd"/>
+      <w:r>
+        <w:t xml:space="preserve"> for management events</w:t>
+      </w:r>
+    </w:p>
+    <w:p>
+      <w:pPr>
+        <w:numPr>
+          <w:ilvl w:val="0"/>
+          <w:numId w:val="12"/>
+        </w:numPr>
+      </w:pPr>
+      <w:r>
+        <w:t>Global service events included</w:t>
+      </w:r>
+    </w:p>
+    <w:p>
+      <w:pPr>
+        <w:numPr>
+          <w:ilvl w:val="0"/>
+          <w:numId w:val="12"/>
+        </w:numPr>
+      </w:pPr>
+      <w:r>
+        <w:t>Log file validation enabled</w:t>
+      </w:r>
+    </w:p>
+    <w:p>
+      <w:pPr>
+        <w:numPr>
+          <w:ilvl w:val="0"/>
+          <w:numId w:val="12"/>
+        </w:numPr>
+      </w:pPr>
+      <w:r>
+        <w:t>Logs delivered to the security S3 bucket</w:t>
+      </w:r>
+    </w:p>
+    <w:p>
+      <w:pPr>
+        <w:numPr>
+          <w:ilvl w:val="0"/>
+          <w:numId w:val="12"/>
+        </w:numPr>
+      </w:pPr>
+      <w:r>
+        <w:t>Logs encrypted with the customer-managed KMS key</w:t>
+      </w:r>
+    </w:p>
+    <w:p>
+      <w:pPr>
+        <w:rPr>
+          <w:b/>
+          <w:bCs/>
+        </w:rPr>
+      </w:pPr>
+      <w:r>
+        <w:rPr>
+          <w:b/>
+          <w:bCs/>
+        </w:rPr>
+        <w:t>AWS Config</w:t>
+      </w:r>
+    </w:p>
+    <w:p>
+      <w:pPr>
+        <w:numPr>
+          <w:ilvl w:val="0"/>
+          <w:numId w:val="13"/>
+        </w:numPr>
+      </w:pPr>
+      <w:r>
+        <w:t>IAM role for the Config service (</w:t>
+      </w:r>
+      <w:proofErr w:type="spellStart"/>
+      <w:r>
+        <w:t>AWS_ConfigRole</w:t>
+      </w:r>
+      <w:proofErr w:type="spellEnd"/>
+      <w:r>
+        <w:t>)</w:t>
+      </w:r>
+    </w:p>
+    <w:p>
+      <w:pPr>
+        <w:numPr>
+          <w:ilvl w:val="0"/>
+          <w:numId w:val="13"/>
+        </w:numPr>
+      </w:pPr>
+      <w:r>
+        <w:t>Additional S3/KMS permissions for custom log bucket delivery</w:t>
+      </w:r>
+    </w:p>
+    <w:p>
+      <w:pPr>
+        <w:numPr>
+          <w:ilvl w:val="0"/>
+          <w:numId w:val="13"/>
+        </w:numPr>
+      </w:pPr>
+      <w:r>
+        <w:t>Configuration recorder (all supported resources + global resource types)</w:t>
+      </w:r>
+    </w:p>
+    <w:p>
+      <w:pPr>
+        <w:numPr>
+          <w:ilvl w:val="0"/>
+          <w:numId w:val="13"/>
+        </w:numPr>
+      </w:pPr>
+      <w:r>
+        <w:t>Delivery channel to the security S3 bucket (config/ prefix)</w:t>
+      </w:r>
+    </w:p>
+    <w:p>
+      <w:pPr>
+        <w:numPr>
+          <w:ilvl w:val="0"/>
+          <w:numId w:val="13"/>
+        </w:numPr>
+      </w:pPr>
+      <w:r>
+        <w:t>Recorder enabled after delivery channel is configured</w:t>
+      </w:r>
+    </w:p>
+    <w:p>
+      <w:pPr>
+        <w:numPr>
+          <w:ilvl w:val="0"/>
+          <w:numId w:val="13"/>
+        </w:numPr>
+      </w:pPr>
+      <w:r>
+        <w:t>Managed Config rules (toggle via </w:t>
+      </w:r>
+      <w:proofErr w:type="spellStart"/>
+      <w:r>
+        <w:t>enable_config_rules</w:t>
+      </w:r>
+      <w:proofErr w:type="spellEnd"/>
+      <w:r>
+        <w:t xml:space="preserve">): </w:t>
+      </w:r>
+    </w:p>
+    <w:p>
+      <w:pPr>
+        <w:numPr>
+          <w:ilvl w:val="1"/>
+          <w:numId w:val="13"/>
+        </w:numPr>
+      </w:pPr>
+      <w:r>
+        <w:t>S3 bucket public read prohibited</w:t>
+      </w:r>
+    </w:p>
+    <w:p>
+      <w:pPr>
+        <w:numPr>
+          <w:ilvl w:val="1"/>
+          <w:numId w:val="13"/>
+        </w:numPr>
+      </w:pPr>
+      <w:r>
+        <w:t>S3 bucket SSL requests only</w:t>
+      </w:r>
+    </w:p>
+    <w:p>
+      <w:pPr>
+        <w:numPr>
+          <w:ilvl w:val="1"/>
+          <w:numId w:val="13"/>
+        </w:numPr>
+      </w:pPr>
+      <w:r>
+        <w:t>Encrypted EBS volumes</w:t>
+      </w:r>
+    </w:p>
+    <w:p>
+      <w:pPr>
+        <w:rPr>
+          <w:b/>
+          <w:bCs/>
+        </w:rPr>
+      </w:pPr>
+      <w:r>
+        <w:rPr>
+          <w:b/>
+          <w:bCs/>
+        </w:rPr>
+        <w:t>GuardDuty (optional)</w:t>
+      </w:r>
+    </w:p>
+    <w:p>
+      <w:pPr>
+        <w:numPr>
+          <w:ilvl w:val="0"/>
+          <w:numId w:val="14"/>
+        </w:numPr>
+      </w:pPr>
+      <w:r>
+        <w:t>GuardDuty detector enabled (</w:t>
+      </w:r>
+      <w:proofErr w:type="spellStart"/>
+      <w:r>
+        <w:t>enable_guardduty</w:t>
+      </w:r>
+      <w:proofErr w:type="spellEnd"/>
+      <w:r>
+        <w:t xml:space="preserve"> = true)</w:t>
+      </w:r>
+    </w:p>
+    <w:p>
+      <w:pPr>
+        <w:numPr>
+          <w:ilvl w:val="0"/>
+          <w:numId w:val="14"/>
+        </w:numPr>
+      </w:pPr>
+      <w:r>
+        <w:t>Can be disabled on free/new accounts that hit </w:t>
+      </w:r>
+      <w:proofErr w:type="spellStart"/>
+      <w:r>
+        <w:t>SubscriptionRequiredException</w:t>
+      </w:r>
+      <w:proofErr w:type="spellEnd"/>
+    </w:p>
+    <w:p>
+      <w:pPr>
+        <w:rPr>
+          <w:b/>
+          <w:bCs/>
+        </w:rPr>
+      </w:pPr>
+      <w:r>
+        <w:rPr>
+          <w:b/>
+          <w:bCs/>
+        </w:rPr>
+        <w:t xml:space="preserve">IAM — </w:t>
+      </w:r>
+      <w:proofErr w:type="spellStart"/>
+      <w:r>
+        <w:rPr>
+          <w:b/>
+          <w:bCs/>
+        </w:rPr>
+        <w:t>SecurityAudit</w:t>
+      </w:r>
+      <w:proofErr w:type="spellEnd"/>
+      <w:r>
+        <w:rPr>
+          <w:b/>
+          <w:bCs/>
+        </w:rPr>
+        <w:t xml:space="preserve"> role</w:t>
+      </w:r>
+    </w:p>
+    <w:p>
+      <w:pPr>
+        <w:numPr>
+          <w:ilvl w:val="0"/>
+          <w:numId w:val="15"/>
+        </w:numPr>
+      </w:pPr>
+      <w:r>
+        <w:t>Least-privilege IAM role for security review/auditing</w:t>
+      </w:r>
+    </w:p>
+    <w:p>
+      <w:pPr>
+        <w:numPr>
+          <w:ilvl w:val="0"/>
+          <w:numId w:val="15"/>
+        </w:numPr>
+      </w:pPr>
+      <w:r>
+        <w:t>AWS managed </w:t>
+      </w:r>
+      <w:proofErr w:type="spellStart"/>
+      <w:r>
+        <w:t>SecurityAudit</w:t>
+      </w:r>
+      <w:proofErr w:type="spellEnd"/>
+      <w:r>
+        <w:t> policy attached</w:t>
+      </w:r>
+    </w:p>
+    <w:p>
+      <w:pPr>
+        <w:numPr>
+          <w:ilvl w:val="0"/>
+          <w:numId w:val="15"/>
+        </w:numPr>
+      </w:pPr>
+      <w:r>
+        <w:t>Assume role requires MFA (</w:t>
+      </w:r>
+      <w:proofErr w:type="spellStart"/>
+      <w:proofErr w:type="gramStart"/>
+      <w:r>
+        <w:t>aws:MultiFactorAuthPresent</w:t>
+      </w:r>
+      <w:proofErr w:type="spellEnd"/>
+      <w:proofErr w:type="gramEnd"/>
+      <w:r>
+        <w:t>)</w:t>
+      </w:r>
+    </w:p>
+    <w:p>
+      <w:pPr>
+        <w:rPr>
+          <w:b/>
+          <w:bCs/>
+        </w:rPr>
+      </w:pPr>
+      <w:r>
+        <w:rPr>
+          <w:b/>
+          <w:bCs/>
+        </w:rPr>
+        <w:t>Integration &amp; ops</w:t>
+      </w:r>
+    </w:p>
+    <w:p>
+      <w:pPr>
+        <w:numPr>
+          <w:ilvl w:val="0"/>
+          <w:numId w:val="16"/>
+        </w:numPr>
+      </w:pPr>
+      <w:r>
+        <w:lastRenderedPageBreak/>
+        <w:t>Wired into root stack via </w:t>
+      </w:r>
+      <w:proofErr w:type="spellStart"/>
+      <w:r>
+        <w:t>enable_security</w:t>
+      </w:r>
+      <w:proofErr w:type="spellEnd"/>
+      <w:r>
+        <w:t>, </w:t>
+      </w:r>
+      <w:proofErr w:type="spellStart"/>
+      <w:r>
+        <w:t>enable_config_rules</w:t>
+      </w:r>
+      <w:proofErr w:type="spellEnd"/>
+      <w:r>
+        <w:t>, and </w:t>
+      </w:r>
+      <w:proofErr w:type="spellStart"/>
+      <w:r>
+        <w:t>enable_guardduty</w:t>
+      </w:r>
+      <w:proofErr w:type="spellEnd"/>
+      <w:r>
+        <w:t> variables</w:t>
+      </w:r>
+    </w:p>
+    <w:p>
+      <w:pPr>
+        <w:numPr>
+          <w:ilvl w:val="0"/>
+          <w:numId w:val="16"/>
+        </w:numPr>
+      </w:pPr>
+      <w:r>
+        <w:t>Documented in module README and project ARCHITECTURE.md</w:t>
+      </w:r>
+    </w:p>
+    <w:p>
+      <w:pPr>
+        <w:numPr>
+          <w:ilvl w:val="0"/>
+          <w:numId w:val="16"/>
+        </w:numPr>
+      </w:pPr>
+      <w:r>
+        <w:t>Lab-friendly defaults: </w:t>
+      </w:r>
+      <w:proofErr w:type="spellStart"/>
+      <w:r>
+        <w:t>force_destroy</w:t>
+      </w:r>
+      <w:proofErr w:type="spellEnd"/>
+      <w:r>
+        <w:t> on log bucket; security toggle off until demo; stack destroyed when idle to control cost</w:t>
+      </w:r>
+    </w:p>
+    <w:p/>
     <w:sectPr>
       <w:headerReference w:type="default" r:id="rId8"/>
       <w:pgSz w:w="12240" w:h="15840"/>
@@ -964,7 +1628,7 @@
 </file>
 
 <file path=word/endnotes.xml><?xml version="1.0" encoding="utf-8"?>
-<w:endnotes xmlns:wpc="http://schemas.microsoft.com/office/word/2010/wordprocessingCanvas" xmlns:cx="http://schemas.microsoft.com/office/drawing/2014/chartex" xmlns:cx1="http://schemas.microsoft.com/office/drawing/2015/9/8/chartex" xmlns:cx2="http://schemas.microsoft.com/office/drawing/2015/10/21/chartex" xmlns:cx3="http://schemas.microsoft.com/office/drawing/2016/5/9/chartex" xmlns:cx4="http://schemas.microsoft.com/office/drawing/2016/5/10/chartex" xmlns:cx5="http://schemas.microsoft.com/office/drawing/2016/5/11/chartex" xmlns:cx6="http://schemas.microsoft.com/office/drawing/2016/5/12/chartex" xmlns:cx7="http://schemas.microsoft.com/office/drawing/2016/5/13/chartex" xmlns:cx8="http://schemas.microsoft.com/office/drawing/2016/5/14/chartex" xmlns:mc="http://schemas.openxmlformats.org/markup-compatibility/2006" xmlns:aink="http://schemas.microsoft.com/office/drawing/2016/ink" xmlns:am3d="http://schemas.microsoft.com/office/drawing/2017/model3d" xmlns:o="urn:schemas-microsoft-com:office:office" xmlns:oel="http://schemas.microsoft.com/office/2019/extlst" xmlns:r="http://schemas.openxmlformats.org/officeDocument/2006/relationships" xmlns:m="http://schemas.openxmlformats.org/officeDocument/2006/math" xmlns:v="urn:schemas-microsoft-com:vml" xmlns:wp14="http://schemas.microsoft.com/office/word/2010/wordprocessingDrawing" xmlns:wp="http://schemas.openxmlformats.org/drawingml/2006/wordprocessingDrawing" xmlns:w10="urn:schemas-microsoft-com:office:word" xmlns:w="http://schemas.openxmlformats.org/wordprocessingml/2006/main" xmlns:w14="http://schemas.microsoft.com/office/word/2010/wordml" xmlns:w15="http://schemas.microsoft.com/office/word/2012/wordml" xmlns:w16cei="http://schemas.microsoft.com/office/word/2026/wordml/cei" xmlns:w16cex="http://schemas.microsoft.com/office/word/2018/wordml/cex" xmlns:w16cid="http://schemas.microsoft.com/office/word/2016/wordml/cid" xmlns:w16="http://schemas.microsoft.com/office/word/2018/wordml" xmlns:w16du="http://schemas.microsoft.com/office/word/2023/wordml/word16du" xmlns:w16sdtdh="http://schemas.microsoft.com/office/word/2020/wordml/sdtdatahash" xmlns:w16sdtfl="http://schemas.microsoft.com/office/word/2024/wordml/sdtformatlock" xmlns:w16se="http://schemas.microsoft.com/office/word/2015/wordml/symex" xmlns:wpg="http://schemas.microsoft.com/office/word/2010/wordprocessingGroup" xmlns:wpi="http://schemas.microsoft.com/office/word/2010/wordprocessingInk" xmlns:wne="http://schemas.microsoft.com/office/word/2006/wordml" xmlns:wps="http://schemas.microsoft.com/office/word/2010/wordprocessingShape" mc:Ignorable="w14 w15 w16se w16cid w16 w16cex w16sdtdh w16sdtfl w16du wp14">
+<w:endnotes xmlns:wpc="http://schemas.microsoft.com/office/word/2010/wordprocessingCanvas" xmlns:cx="http://schemas.microsoft.com/office/drawing/2014/chartex" xmlns:cx1="http://schemas.microsoft.com/office/drawing/2015/9/8/chartex" xmlns:cx2="http://schemas.microsoft.com/office/drawing/2015/10/21/chartex" xmlns:cx3="http://schemas.microsoft.com/office/drawing/2016/5/9/chartex" xmlns:cx4="http://schemas.microsoft.com/office/drawing/2016/5/10/chartex" xmlns:cx5="http://schemas.microsoft.com/office/drawing/2016/5/11/chartex" xmlns:cx6="http://schemas.microsoft.com/office/drawing/2016/5/12/chartex" xmlns:cx7="http://schemas.microsoft.com/office/drawing/2016/5/13/chartex" xmlns:cx8="http://schemas.microsoft.com/office/drawing/2016/5/14/chartex" xmlns:mc="http://schemas.openxmlformats.org/markup-compatibility/2006" xmlns:aink="http://schemas.microsoft.com/office/drawing/2016/ink" xmlns:am3d="http://schemas.microsoft.com/office/drawing/2017/model3d" xmlns:o="urn:schemas-microsoft-com:office:office" xmlns:oel="http://schemas.microsoft.com/office/2019/extlst" xmlns:r="http://schemas.openxmlformats.org/officeDocument/2006/relationships" xmlns:m="http://schemas.openxmlformats.org/officeDocument/2006/math" xmlns:v="urn:schemas-microsoft-com:vml" xmlns:wp14="http://schemas.microsoft.com/office/word/2010/wordprocessingDrawing" xmlns:wp="http://schemas.openxmlformats.org/drawingml/2006/wordprocessingDrawing" xmlns:w10="urn:schemas-microsoft-com:office:word" xmlns:w="http://schemas.openxmlformats.org/wordprocessingml/2006/main" xmlns:w14="http://schemas.microsoft.com/office/word/2010/wordml" xmlns:w15="http://schemas.microsoft.com/office/word/2012/wordml" xmlns:w16cex="http://schemas.microsoft.com/office/word/2018/wordml/cex" xmlns:w16cid="http://schemas.microsoft.com/office/word/2016/wordml/cid" xmlns:w16="http://schemas.microsoft.com/office/word/2018/wordml" xmlns:w16du="http://schemas.microsoft.com/office/word/2023/wordml/word16du" xmlns:w16sdtdh="http://schemas.microsoft.com/office/word/2020/wordml/sdtdatahash" xmlns:w16sdtfl="http://schemas.microsoft.com/office/word/2024/wordml/sdtformatlock" xmlns:w16se="http://schemas.microsoft.com/office/word/2015/wordml/symex" xmlns:wpg="http://schemas.microsoft.com/office/word/2010/wordprocessingGroup" xmlns:wpi="http://schemas.microsoft.com/office/word/2010/wordprocessingInk" xmlns:wne="http://schemas.microsoft.com/office/word/2006/wordml" xmlns:wps="http://schemas.microsoft.com/office/word/2010/wordprocessingShape" mc:Ignorable="w14 w15 w16se w16cid w16 w16cex w16sdtdh w16sdtfl w16du wp14">
   <w:endnote w:type="separator" w:id="-1">
     <w:p>
       <w:pPr>
@@ -989,7 +1653,7 @@
 </file>
 
 <file path=word/footnotes.xml><?xml version="1.0" encoding="utf-8"?>
-<w:footnotes xmlns:wpc="http://schemas.microsoft.com/office/word/2010/wordprocessingCanvas" xmlns:cx="http://schemas.microsoft.com/office/drawing/2014/chartex" xmlns:cx1="http://schemas.microsoft.com/office/drawing/2015/9/8/chartex" xmlns:cx2="http://schemas.microsoft.com/office/drawing/2015/10/21/chartex" xmlns:cx3="http://schemas.microsoft.com/office/drawing/2016/5/9/chartex" xmlns:cx4="http://schemas.microsoft.com/office/drawing/2016/5/10/chartex" xmlns:cx5="http://schemas.microsoft.com/office/drawing/2016/5/11/chartex" xmlns:cx6="http://schemas.microsoft.com/office/drawing/2016/5/12/chartex" xmlns:cx7="http://schemas.microsoft.com/office/drawing/2016/5/13/chartex" xmlns:cx8="http://schemas.microsoft.com/office/drawing/2016/5/14/chartex" xmlns:mc="http://schemas.openxmlformats.org/markup-compatibility/2006" xmlns:aink="http://schemas.microsoft.com/office/drawing/2016/ink" xmlns:am3d="http://schemas.microsoft.com/office/drawing/2017/model3d" xmlns:o="urn:schemas-microsoft-com:office:office" xmlns:oel="http://schemas.microsoft.com/office/2019/extlst" xmlns:r="http://schemas.openxmlformats.org/officeDocument/2006/relationships" xmlns:m="http://schemas.openxmlformats.org/officeDocument/2006/math" xmlns:v="urn:schemas-microsoft-com:vml" xmlns:wp14="http://schemas.microsoft.com/office/word/2010/wordprocessingDrawing" xmlns:wp="http://schemas.openxmlformats.org/drawingml/2006/wordprocessingDrawing" xmlns:w10="urn:schemas-microsoft-com:office:word" xmlns:w="http://schemas.openxmlformats.org/wordprocessingml/2006/main" xmlns:w14="http://schemas.microsoft.com/office/word/2010/wordml" xmlns:w15="http://schemas.microsoft.com/office/word/2012/wordml" xmlns:w16cei="http://schemas.microsoft.com/office/word/2026/wordml/cei" xmlns:w16cex="http://schemas.microsoft.com/office/word/2018/wordml/cex" xmlns:w16cid="http://schemas.microsoft.com/office/word/2016/wordml/cid" xmlns:w16="http://schemas.microsoft.com/office/word/2018/wordml" xmlns:w16du="http://schemas.microsoft.com/office/word/2023/wordml/word16du" xmlns:w16sdtdh="http://schemas.microsoft.com/office/word/2020/wordml/sdtdatahash" xmlns:w16sdtfl="http://schemas.microsoft.com/office/word/2024/wordml/sdtformatlock" xmlns:w16se="http://schemas.microsoft.com/office/word/2015/wordml/symex" xmlns:wpg="http://schemas.microsoft.com/office/word/2010/wordprocessingGroup" xmlns:wpi="http://schemas.microsoft.com/office/word/2010/wordprocessingInk" xmlns:wne="http://schemas.microsoft.com/office/word/2006/wordml" xmlns:wps="http://schemas.microsoft.com/office/word/2010/wordprocessingShape" mc:Ignorable="w14 w15 w16se w16cid w16 w16cex w16sdtdh w16sdtfl w16du wp14">
+<w:footnotes xmlns:wpc="http://schemas.microsoft.com/office/word/2010/wordprocessingCanvas" xmlns:cx="http://schemas.microsoft.com/office/drawing/2014/chartex" xmlns:cx1="http://schemas.microsoft.com/office/drawing/2015/9/8/chartex" xmlns:cx2="http://schemas.microsoft.com/office/drawing/2015/10/21/chartex" xmlns:cx3="http://schemas.microsoft.com/office/drawing/2016/5/9/chartex" xmlns:cx4="http://schemas.microsoft.com/office/drawing/2016/5/10/chartex" xmlns:cx5="http://schemas.microsoft.com/office/drawing/2016/5/11/chartex" xmlns:cx6="http://schemas.microsoft.com/office/drawing/2016/5/12/chartex" xmlns:cx7="http://schemas.microsoft.com/office/drawing/2016/5/13/chartex" xmlns:cx8="http://schemas.microsoft.com/office/drawing/2016/5/14/chartex" xmlns:mc="http://schemas.openxmlformats.org/markup-compatibility/2006" xmlns:aink="http://schemas.microsoft.com/office/drawing/2016/ink" xmlns:am3d="http://schemas.microsoft.com/office/drawing/2017/model3d" xmlns:o="urn:schemas-microsoft-com:office:office" xmlns:oel="http://schemas.microsoft.com/office/2019/extlst" xmlns:r="http://schemas.openxmlformats.org/officeDocument/2006/relationships" xmlns:m="http://schemas.openxmlformats.org/officeDocument/2006/math" xmlns:v="urn:schemas-microsoft-com:vml" xmlns:wp14="http://schemas.microsoft.com/office/word/2010/wordprocessingDrawing" xmlns:wp="http://schemas.openxmlformats.org/drawingml/2006/wordprocessingDrawing" xmlns:w10="urn:schemas-microsoft-com:office:word" xmlns:w="http://schemas.openxmlformats.org/wordprocessingml/2006/main" xmlns:w14="http://schemas.microsoft.com/office/word/2010/wordml" xmlns:w15="http://schemas.microsoft.com/office/word/2012/wordml" xmlns:w16cex="http://schemas.microsoft.com/office/word/2018/wordml/cex" xmlns:w16cid="http://schemas.microsoft.com/office/word/2016/wordml/cid" xmlns:w16="http://schemas.microsoft.com/office/word/2018/wordml" xmlns:w16du="http://schemas.microsoft.com/office/word/2023/wordml/word16du" xmlns:w16sdtdh="http://schemas.microsoft.com/office/word/2020/wordml/sdtdatahash" xmlns:w16sdtfl="http://schemas.microsoft.com/office/word/2024/wordml/sdtformatlock" xmlns:w16se="http://schemas.microsoft.com/office/word/2015/wordml/symex" xmlns:wpg="http://schemas.microsoft.com/office/word/2010/wordprocessingGroup" xmlns:wpi="http://schemas.microsoft.com/office/word/2010/wordprocessingInk" xmlns:wne="http://schemas.microsoft.com/office/word/2006/wordml" xmlns:wps="http://schemas.microsoft.com/office/word/2010/wordprocessingShape" mc:Ignorable="w14 w15 w16se w16cid w16 w16cex w16sdtdh w16sdtfl w16du wp14">
   <w:footnote w:type="separator" w:id="-1">
     <w:p>
       <w:pPr>
@@ -1014,7 +1678,7 @@
 </file>
 
 <file path=word/header1.xml><?xml version="1.0" encoding="utf-8"?>
-<w:hdr xmlns:wpc="http://schemas.microsoft.com/office/word/2010/wordprocessingCanvas" xmlns:cx="http://schemas.microsoft.com/office/drawing/2014/chartex" xmlns:cx1="http://schemas.microsoft.com/office/drawing/2015/9/8/chartex" xmlns:cx2="http://schemas.microsoft.com/office/drawing/2015/10/21/chartex" xmlns:cx3="http://schemas.microsoft.com/office/drawing/2016/5/9/chartex" xmlns:cx4="http://schemas.microsoft.com/office/drawing/2016/5/10/chartex" xmlns:cx5="http://schemas.microsoft.com/office/drawing/2016/5/11/chartex" xmlns:cx6="http://schemas.microsoft.com/office/drawing/2016/5/12/chartex" xmlns:cx7="http://schemas.microsoft.com/office/drawing/2016/5/13/chartex" xmlns:cx8="http://schemas.microsoft.com/office/drawing/2016/5/14/chartex" xmlns:mc="http://schemas.openxmlformats.org/markup-compatibility/2006" xmlns:aink="http://schemas.microsoft.com/office/drawing/2016/ink" xmlns:am3d="http://schemas.microsoft.com/office/drawing/2017/model3d" xmlns:o="urn:schemas-microsoft-com:office:office" xmlns:oel="http://schemas.microsoft.com/office/2019/extlst" xmlns:r="http://schemas.openxmlformats.org/officeDocument/2006/relationships" xmlns:m="http://schemas.openxmlformats.org/officeDocument/2006/math" xmlns:v="urn:schemas-microsoft-com:vml" xmlns:wp14="http://schemas.microsoft.com/office/word/2010/wordprocessingDrawing" xmlns:wp="http://schemas.openxmlformats.org/drawingml/2006/wordprocessingDrawing" xmlns:w10="urn:schemas-microsoft-com:office:word" xmlns:w="http://schemas.openxmlformats.org/wordprocessingml/2006/main" xmlns:w14="http://schemas.microsoft.com/office/word/2010/wordml" xmlns:w15="http://schemas.microsoft.com/office/word/2012/wordml" xmlns:w16cei="http://schemas.microsoft.com/office/word/2026/wordml/cei" xmlns:w16cex="http://schemas.microsoft.com/office/word/2018/wordml/cex" xmlns:w16cid="http://schemas.microsoft.com/office/word/2016/wordml/cid" xmlns:w16="http://schemas.microsoft.com/office/word/2018/wordml" xmlns:w16du="http://schemas.microsoft.com/office/word/2023/wordml/word16du" xmlns:w16sdtdh="http://schemas.microsoft.com/office/word/2020/wordml/sdtdatahash" xmlns:w16sdtfl="http://schemas.microsoft.com/office/word/2024/wordml/sdtformatlock" xmlns:w16se="http://schemas.microsoft.com/office/word/2015/wordml/symex" xmlns:wpg="http://schemas.microsoft.com/office/word/2010/wordprocessingGroup" xmlns:wpi="http://schemas.microsoft.com/office/word/2010/wordprocessingInk" xmlns:wne="http://schemas.microsoft.com/office/word/2006/wordml" xmlns:wps="http://schemas.microsoft.com/office/word/2010/wordprocessingShape" mc:Ignorable="w14 w15 w16se w16cid w16 w16cex w16sdtdh w16sdtfl w16du wp14">
+<w:hdr xmlns:wpc="http://schemas.microsoft.com/office/word/2010/wordprocessingCanvas" xmlns:cx="http://schemas.microsoft.com/office/drawing/2014/chartex" xmlns:cx1="http://schemas.microsoft.com/office/drawing/2015/9/8/chartex" xmlns:cx2="http://schemas.microsoft.com/office/drawing/2015/10/21/chartex" xmlns:cx3="http://schemas.microsoft.com/office/drawing/2016/5/9/chartex" xmlns:cx4="http://schemas.microsoft.com/office/drawing/2016/5/10/chartex" xmlns:cx5="http://schemas.microsoft.com/office/drawing/2016/5/11/chartex" xmlns:cx6="http://schemas.microsoft.com/office/drawing/2016/5/12/chartex" xmlns:cx7="http://schemas.microsoft.com/office/drawing/2016/5/13/chartex" xmlns:cx8="http://schemas.microsoft.com/office/drawing/2016/5/14/chartex" xmlns:mc="http://schemas.openxmlformats.org/markup-compatibility/2006" xmlns:aink="http://schemas.microsoft.com/office/drawing/2016/ink" xmlns:am3d="http://schemas.microsoft.com/office/drawing/2017/model3d" xmlns:o="urn:schemas-microsoft-com:office:office" xmlns:oel="http://schemas.microsoft.com/office/2019/extlst" xmlns:r="http://schemas.openxmlformats.org/officeDocument/2006/relationships" xmlns:m="http://schemas.openxmlformats.org/officeDocument/2006/math" xmlns:v="urn:schemas-microsoft-com:vml" xmlns:wp14="http://schemas.microsoft.com/office/word/2010/wordprocessingDrawing" xmlns:wp="http://schemas.openxmlformats.org/drawingml/2006/wordprocessingDrawing" xmlns:w10="urn:schemas-microsoft-com:office:word" xmlns:w="http://schemas.openxmlformats.org/wordprocessingml/2006/main" xmlns:w14="http://schemas.microsoft.com/office/word/2010/wordml" xmlns:w15="http://schemas.microsoft.com/office/word/2012/wordml" xmlns:w16cex="http://schemas.microsoft.com/office/word/2018/wordml/cex" xmlns:w16cid="http://schemas.microsoft.com/office/word/2016/wordml/cid" xmlns:w16="http://schemas.microsoft.com/office/word/2018/wordml" xmlns:w16du="http://schemas.microsoft.com/office/word/2023/wordml/word16du" xmlns:w16sdtdh="http://schemas.microsoft.com/office/word/2020/wordml/sdtdatahash" xmlns:w16sdtfl="http://schemas.microsoft.com/office/word/2024/wordml/sdtformatlock" xmlns:w16se="http://schemas.microsoft.com/office/word/2015/wordml/symex" xmlns:wpg="http://schemas.microsoft.com/office/word/2010/wordprocessingGroup" xmlns:wpi="http://schemas.microsoft.com/office/word/2010/wordprocessingInk" xmlns:wne="http://schemas.microsoft.com/office/word/2006/wordml" xmlns:wps="http://schemas.microsoft.com/office/word/2010/wordprocessingShape" mc:Ignorable="w14 w15 w16se w16cid w16 w16cex w16sdtdh w16sdtfl w16du wp14">
   <w:sdt>
     <w:sdtPr>
       <w:id w:val="801971610"/>
@@ -1067,7 +1731,7 @@
 </file>
 
 <file path=word/numbering.xml><?xml version="1.0" encoding="utf-8"?>
-<w:numbering xmlns:wpc="http://schemas.microsoft.com/office/word/2010/wordprocessingCanvas" xmlns:cx="http://schemas.microsoft.com/office/drawing/2014/chartex" xmlns:cx1="http://schemas.microsoft.com/office/drawing/2015/9/8/chartex" xmlns:cx2="http://schemas.microsoft.com/office/drawing/2015/10/21/chartex" xmlns:cx3="http://schemas.microsoft.com/office/drawing/2016/5/9/chartex" xmlns:cx4="http://schemas.microsoft.com/office/drawing/2016/5/10/chartex" xmlns:cx5="http://schemas.microsoft.com/office/drawing/2016/5/11/chartex" xmlns:cx6="http://schemas.microsoft.com/office/drawing/2016/5/12/chartex" xmlns:cx7="http://schemas.microsoft.com/office/drawing/2016/5/13/chartex" xmlns:cx8="http://schemas.microsoft.com/office/drawing/2016/5/14/chartex" xmlns:mc="http://schemas.openxmlformats.org/markup-compatibility/2006" xmlns:aink="http://schemas.microsoft.com/office/drawing/2016/ink" xmlns:am3d="http://schemas.microsoft.com/office/drawing/2017/model3d" xmlns:o="urn:schemas-microsoft-com:office:office" xmlns:oel="http://schemas.microsoft.com/office/2019/extlst" xmlns:r="http://schemas.openxmlformats.org/officeDocument/2006/relationships" xmlns:m="http://schemas.openxmlformats.org/officeDocument/2006/math" xmlns:v="urn:schemas-microsoft-com:vml" xmlns:wp14="http://schemas.microsoft.com/office/word/2010/wordprocessingDrawing" xmlns:wp="http://schemas.openxmlformats.org/drawingml/2006/wordprocessingDrawing" xmlns:w10="urn:schemas-microsoft-com:office:word" xmlns:w="http://schemas.openxmlformats.org/wordprocessingml/2006/main" xmlns:w14="http://schemas.microsoft.com/office/word/2010/wordml" xmlns:w15="http://schemas.microsoft.com/office/word/2012/wordml" xmlns:w16cei="http://schemas.microsoft.com/office/word/2026/wordml/cei" xmlns:w16cex="http://schemas.microsoft.com/office/word/2018/wordml/cex" xmlns:w16cid="http://schemas.microsoft.com/office/word/2016/wordml/cid" xmlns:w16="http://schemas.microsoft.com/office/word/2018/wordml" xmlns:w16du="http://schemas.microsoft.com/office/word/2023/wordml/word16du" xmlns:w16sdtdh="http://schemas.microsoft.com/office/word/2020/wordml/sdtdatahash" xmlns:w16sdtfl="http://schemas.microsoft.com/office/word/2024/wordml/sdtformatlock" xmlns:w16se="http://schemas.microsoft.com/office/word/2015/wordml/symex" xmlns:wpg="http://schemas.microsoft.com/office/word/2010/wordprocessingGroup" xmlns:wpi="http://schemas.microsoft.com/office/word/2010/wordprocessingInk" xmlns:wne="http://schemas.microsoft.com/office/word/2006/wordml" xmlns:wps="http://schemas.microsoft.com/office/word/2010/wordprocessingShape" mc:Ignorable="w14 w15 w16se w16cid w16 w16cex w16sdtdh w16sdtfl w16du wp14">
+<w:numbering xmlns:wpc="http://schemas.microsoft.com/office/word/2010/wordprocessingCanvas" xmlns:cx="http://schemas.microsoft.com/office/drawing/2014/chartex" xmlns:cx1="http://schemas.microsoft.com/office/drawing/2015/9/8/chartex" xmlns:cx2="http://schemas.microsoft.com/office/drawing/2015/10/21/chartex" xmlns:cx3="http://schemas.microsoft.com/office/drawing/2016/5/9/chartex" xmlns:cx4="http://schemas.microsoft.com/office/drawing/2016/5/10/chartex" xmlns:cx5="http://schemas.microsoft.com/office/drawing/2016/5/11/chartex" xmlns:cx6="http://schemas.microsoft.com/office/drawing/2016/5/12/chartex" xmlns:cx7="http://schemas.microsoft.com/office/drawing/2016/5/13/chartex" xmlns:cx8="http://schemas.microsoft.com/office/drawing/2016/5/14/chartex" xmlns:mc="http://schemas.openxmlformats.org/markup-compatibility/2006" xmlns:aink="http://schemas.microsoft.com/office/drawing/2016/ink" xmlns:am3d="http://schemas.microsoft.com/office/drawing/2017/model3d" xmlns:o="urn:schemas-microsoft-com:office:office" xmlns:oel="http://schemas.microsoft.com/office/2019/extlst" xmlns:r="http://schemas.openxmlformats.org/officeDocument/2006/relationships" xmlns:m="http://schemas.openxmlformats.org/officeDocument/2006/math" xmlns:v="urn:schemas-microsoft-com:vml" xmlns:wp14="http://schemas.microsoft.com/office/word/2010/wordprocessingDrawing" xmlns:wp="http://schemas.openxmlformats.org/drawingml/2006/wordprocessingDrawing" xmlns:w10="urn:schemas-microsoft-com:office:word" xmlns:w="http://schemas.openxmlformats.org/wordprocessingml/2006/main" xmlns:w14="http://schemas.microsoft.com/office/word/2010/wordml" xmlns:w15="http://schemas.microsoft.com/office/word/2012/wordml" xmlns:w16cex="http://schemas.microsoft.com/office/word/2018/wordml/cex" xmlns:w16cid="http://schemas.microsoft.com/office/word/2016/wordml/cid" xmlns:w16="http://schemas.microsoft.com/office/word/2018/wordml" xmlns:w16du="http://schemas.microsoft.com/office/word/2023/wordml/word16du" xmlns:w16sdtdh="http://schemas.microsoft.com/office/word/2020/wordml/sdtdatahash" xmlns:w16sdtfl="http://schemas.microsoft.com/office/word/2024/wordml/sdtformatlock" xmlns:w16se="http://schemas.microsoft.com/office/word/2015/wordml/symex" xmlns:wpg="http://schemas.microsoft.com/office/word/2010/wordprocessingGroup" xmlns:wpi="http://schemas.microsoft.com/office/word/2010/wordprocessingInk" xmlns:wne="http://schemas.microsoft.com/office/word/2006/wordml" xmlns:wps="http://schemas.microsoft.com/office/word/2010/wordprocessingShape" mc:Ignorable="w14 w15 w16se w16cid w16 w16cex w16sdtdh w16sdtfl w16du wp14">
   <w:abstractNum w:abstractNumId="0" w15:restartNumberingAfterBreak="0">
     <w:nsid w:val="057467F1"/>
     <w:multiLevelType w:val="multilevel"/>
@@ -1218,6 +1882,304 @@
     </w:lvl>
   </w:abstractNum>
   <w:abstractNum w:abstractNumId="1" w15:restartNumberingAfterBreak="0">
+    <w:nsid w:val="08D342DB"/>
+    <w:multiLevelType w:val="multilevel"/>
+    <w:tmpl w:val="2B36FE10"/>
+    <w:lvl w:ilvl="0">
+      <w:start w:val="1"/>
+      <w:numFmt w:val="bullet"/>
+      <w:lvlText w:val=""/>
+      <w:lvlJc w:val="left"/>
+      <w:pPr>
+        <w:tabs>
+          <w:tab w:val="num" w:pos="720"/>
+        </w:tabs>
+        <w:ind w:left="720" w:hanging="360"/>
+      </w:pPr>
+      <w:rPr>
+        <w:rFonts w:ascii="Symbol" w:hAnsi="Symbol" w:hint="default"/>
+        <w:sz w:val="20"/>
+      </w:rPr>
+    </w:lvl>
+    <w:lvl w:ilvl="1" w:tentative="1">
+      <w:start w:val="1"/>
+      <w:numFmt w:val="bullet"/>
+      <w:lvlText w:val="o"/>
+      <w:lvlJc w:val="left"/>
+      <w:pPr>
+        <w:tabs>
+          <w:tab w:val="num" w:pos="1440"/>
+        </w:tabs>
+        <w:ind w:left="1440" w:hanging="360"/>
+      </w:pPr>
+      <w:rPr>
+        <w:rFonts w:ascii="Courier New" w:hAnsi="Courier New" w:hint="default"/>
+        <w:sz w:val="20"/>
+      </w:rPr>
+    </w:lvl>
+    <w:lvl w:ilvl="2" w:tentative="1">
+      <w:start w:val="1"/>
+      <w:numFmt w:val="bullet"/>
+      <w:lvlText w:val=""/>
+      <w:lvlJc w:val="left"/>
+      <w:pPr>
+        <w:tabs>
+          <w:tab w:val="num" w:pos="2160"/>
+        </w:tabs>
+        <w:ind w:left="2160" w:hanging="360"/>
+      </w:pPr>
+      <w:rPr>
+        <w:rFonts w:ascii="Wingdings" w:hAnsi="Wingdings" w:hint="default"/>
+        <w:sz w:val="20"/>
+      </w:rPr>
+    </w:lvl>
+    <w:lvl w:ilvl="3" w:tentative="1">
+      <w:start w:val="1"/>
+      <w:numFmt w:val="bullet"/>
+      <w:lvlText w:val=""/>
+      <w:lvlJc w:val="left"/>
+      <w:pPr>
+        <w:tabs>
+          <w:tab w:val="num" w:pos="2880"/>
+        </w:tabs>
+        <w:ind w:left="2880" w:hanging="360"/>
+      </w:pPr>
+      <w:rPr>
+        <w:rFonts w:ascii="Wingdings" w:hAnsi="Wingdings" w:hint="default"/>
+        <w:sz w:val="20"/>
+      </w:rPr>
+    </w:lvl>
+    <w:lvl w:ilvl="4" w:tentative="1">
+      <w:start w:val="1"/>
+      <w:numFmt w:val="bullet"/>
+      <w:lvlText w:val=""/>
+      <w:lvlJc w:val="left"/>
+      <w:pPr>
+        <w:tabs>
+          <w:tab w:val="num" w:pos="3600"/>
+        </w:tabs>
+        <w:ind w:left="3600" w:hanging="360"/>
+      </w:pPr>
+      <w:rPr>
+        <w:rFonts w:ascii="Wingdings" w:hAnsi="Wingdings" w:hint="default"/>
+        <w:sz w:val="20"/>
+      </w:rPr>
+    </w:lvl>
+    <w:lvl w:ilvl="5" w:tentative="1">
+      <w:start w:val="1"/>
+      <w:numFmt w:val="bullet"/>
+      <w:lvlText w:val=""/>
+      <w:lvlJc w:val="left"/>
+      <w:pPr>
+        <w:tabs>
+          <w:tab w:val="num" w:pos="4320"/>
+        </w:tabs>
+        <w:ind w:left="4320" w:hanging="360"/>
+      </w:pPr>
+      <w:rPr>
+        <w:rFonts w:ascii="Wingdings" w:hAnsi="Wingdings" w:hint="default"/>
+        <w:sz w:val="20"/>
+      </w:rPr>
+    </w:lvl>
+    <w:lvl w:ilvl="6" w:tentative="1">
+      <w:start w:val="1"/>
+      <w:numFmt w:val="bullet"/>
+      <w:lvlText w:val=""/>
+      <w:lvlJc w:val="left"/>
+      <w:pPr>
+        <w:tabs>
+          <w:tab w:val="num" w:pos="5040"/>
+        </w:tabs>
+        <w:ind w:left="5040" w:hanging="360"/>
+      </w:pPr>
+      <w:rPr>
+        <w:rFonts w:ascii="Wingdings" w:hAnsi="Wingdings" w:hint="default"/>
+        <w:sz w:val="20"/>
+      </w:rPr>
+    </w:lvl>
+    <w:lvl w:ilvl="7" w:tentative="1">
+      <w:start w:val="1"/>
+      <w:numFmt w:val="bullet"/>
+      <w:lvlText w:val=""/>
+      <w:lvlJc w:val="left"/>
+      <w:pPr>
+        <w:tabs>
+          <w:tab w:val="num" w:pos="5760"/>
+        </w:tabs>
+        <w:ind w:left="5760" w:hanging="360"/>
+      </w:pPr>
+      <w:rPr>
+        <w:rFonts w:ascii="Wingdings" w:hAnsi="Wingdings" w:hint="default"/>
+        <w:sz w:val="20"/>
+      </w:rPr>
+    </w:lvl>
+    <w:lvl w:ilvl="8" w:tentative="1">
+      <w:start w:val="1"/>
+      <w:numFmt w:val="bullet"/>
+      <w:lvlText w:val=""/>
+      <w:lvlJc w:val="left"/>
+      <w:pPr>
+        <w:tabs>
+          <w:tab w:val="num" w:pos="6480"/>
+        </w:tabs>
+        <w:ind w:left="6480" w:hanging="360"/>
+      </w:pPr>
+      <w:rPr>
+        <w:rFonts w:ascii="Wingdings" w:hAnsi="Wingdings" w:hint="default"/>
+        <w:sz w:val="20"/>
+      </w:rPr>
+    </w:lvl>
+  </w:abstractNum>
+  <w:abstractNum w:abstractNumId="2" w15:restartNumberingAfterBreak="0">
+    <w:nsid w:val="0DF22935"/>
+    <w:multiLevelType w:val="multilevel"/>
+    <w:tmpl w:val="0CB4CE6E"/>
+    <w:lvl w:ilvl="0">
+      <w:start w:val="1"/>
+      <w:numFmt w:val="bullet"/>
+      <w:lvlText w:val=""/>
+      <w:lvlJc w:val="left"/>
+      <w:pPr>
+        <w:tabs>
+          <w:tab w:val="num" w:pos="720"/>
+        </w:tabs>
+        <w:ind w:left="720" w:hanging="360"/>
+      </w:pPr>
+      <w:rPr>
+        <w:rFonts w:ascii="Symbol" w:hAnsi="Symbol" w:hint="default"/>
+        <w:sz w:val="20"/>
+      </w:rPr>
+    </w:lvl>
+    <w:lvl w:ilvl="1" w:tentative="1">
+      <w:start w:val="1"/>
+      <w:numFmt w:val="bullet"/>
+      <w:lvlText w:val="o"/>
+      <w:lvlJc w:val="left"/>
+      <w:pPr>
+        <w:tabs>
+          <w:tab w:val="num" w:pos="1440"/>
+        </w:tabs>
+        <w:ind w:left="1440" w:hanging="360"/>
+      </w:pPr>
+      <w:rPr>
+        <w:rFonts w:ascii="Courier New" w:hAnsi="Courier New" w:hint="default"/>
+        <w:sz w:val="20"/>
+      </w:rPr>
+    </w:lvl>
+    <w:lvl w:ilvl="2" w:tentative="1">
+      <w:start w:val="1"/>
+      <w:numFmt w:val="bullet"/>
+      <w:lvlText w:val=""/>
+      <w:lvlJc w:val="left"/>
+      <w:pPr>
+        <w:tabs>
+          <w:tab w:val="num" w:pos="2160"/>
+        </w:tabs>
+        <w:ind w:left="2160" w:hanging="360"/>
+      </w:pPr>
+      <w:rPr>
+        <w:rFonts w:ascii="Wingdings" w:hAnsi="Wingdings" w:hint="default"/>
+        <w:sz w:val="20"/>
+      </w:rPr>
+    </w:lvl>
+    <w:lvl w:ilvl="3" w:tentative="1">
+      <w:start w:val="1"/>
+      <w:numFmt w:val="bullet"/>
+      <w:lvlText w:val=""/>
+      <w:lvlJc w:val="left"/>
+      <w:pPr>
+        <w:tabs>
+          <w:tab w:val="num" w:pos="2880"/>
+        </w:tabs>
+        <w:ind w:left="2880" w:hanging="360"/>
+      </w:pPr>
+      <w:rPr>
+        <w:rFonts w:ascii="Wingdings" w:hAnsi="Wingdings" w:hint="default"/>
+        <w:sz w:val="20"/>
+      </w:rPr>
+    </w:lvl>
+    <w:lvl w:ilvl="4" w:tentative="1">
+      <w:start w:val="1"/>
+      <w:numFmt w:val="bullet"/>
+      <w:lvlText w:val=""/>
+      <w:lvlJc w:val="left"/>
+      <w:pPr>
+        <w:tabs>
+          <w:tab w:val="num" w:pos="3600"/>
+        </w:tabs>
+        <w:ind w:left="3600" w:hanging="360"/>
+      </w:pPr>
+      <w:rPr>
+        <w:rFonts w:ascii="Wingdings" w:hAnsi="Wingdings" w:hint="default"/>
+        <w:sz w:val="20"/>
+      </w:rPr>
+    </w:lvl>
+    <w:lvl w:ilvl="5" w:tentative="1">
+      <w:start w:val="1"/>
+      <w:numFmt w:val="bullet"/>
+      <w:lvlText w:val=""/>
+      <w:lvlJc w:val="left"/>
+      <w:pPr>
+        <w:tabs>
+          <w:tab w:val="num" w:pos="4320"/>
+        </w:tabs>
+        <w:ind w:left="4320" w:hanging="360"/>
+      </w:pPr>
+      <w:rPr>
+        <w:rFonts w:ascii="Wingdings" w:hAnsi="Wingdings" w:hint="default"/>
+        <w:sz w:val="20"/>
+      </w:rPr>
+    </w:lvl>
+    <w:lvl w:ilvl="6" w:tentative="1">
+      <w:start w:val="1"/>
+      <w:numFmt w:val="bullet"/>
+      <w:lvlText w:val=""/>
+      <w:lvlJc w:val="left"/>
+      <w:pPr>
+        <w:tabs>
+          <w:tab w:val="num" w:pos="5040"/>
+        </w:tabs>
+        <w:ind w:left="5040" w:hanging="360"/>
+      </w:pPr>
+      <w:rPr>
+        <w:rFonts w:ascii="Wingdings" w:hAnsi="Wingdings" w:hint="default"/>
+        <w:sz w:val="20"/>
+      </w:rPr>
+    </w:lvl>
+    <w:lvl w:ilvl="7" w:tentative="1">
+      <w:start w:val="1"/>
+      <w:numFmt w:val="bullet"/>
+      <w:lvlText w:val=""/>
+      <w:lvlJc w:val="left"/>
+      <w:pPr>
+        <w:tabs>
+          <w:tab w:val="num" w:pos="5760"/>
+        </w:tabs>
+        <w:ind w:left="5760" w:hanging="360"/>
+      </w:pPr>
+      <w:rPr>
+        <w:rFonts w:ascii="Wingdings" w:hAnsi="Wingdings" w:hint="default"/>
+        <w:sz w:val="20"/>
+      </w:rPr>
+    </w:lvl>
+    <w:lvl w:ilvl="8" w:tentative="1">
+      <w:start w:val="1"/>
+      <w:numFmt w:val="bullet"/>
+      <w:lvlText w:val=""/>
+      <w:lvlJc w:val="left"/>
+      <w:pPr>
+        <w:tabs>
+          <w:tab w:val="num" w:pos="6480"/>
+        </w:tabs>
+        <w:ind w:left="6480" w:hanging="360"/>
+      </w:pPr>
+      <w:rPr>
+        <w:rFonts w:ascii="Wingdings" w:hAnsi="Wingdings" w:hint="default"/>
+        <w:sz w:val="20"/>
+      </w:rPr>
+    </w:lvl>
+  </w:abstractNum>
+  <w:abstractNum w:abstractNumId="3" w15:restartNumberingAfterBreak="0">
     <w:nsid w:val="17374754"/>
     <w:multiLevelType w:val="multilevel"/>
     <w:tmpl w:val="4EA46486"/>
@@ -1366,7 +2328,7 @@
       </w:rPr>
     </w:lvl>
   </w:abstractNum>
-  <w:abstractNum w:abstractNumId="2" w15:restartNumberingAfterBreak="0">
+  <w:abstractNum w:abstractNumId="4" w15:restartNumberingAfterBreak="0">
     <w:nsid w:val="1C4C54A1"/>
     <w:multiLevelType w:val="hybridMultilevel"/>
     <w:tmpl w:val="F750662C"/>
@@ -1479,7 +2441,7 @@
       </w:rPr>
     </w:lvl>
   </w:abstractNum>
-  <w:abstractNum w:abstractNumId="3" w15:restartNumberingAfterBreak="0">
+  <w:abstractNum w:abstractNumId="5" w15:restartNumberingAfterBreak="0">
     <w:nsid w:val="22AC509A"/>
     <w:multiLevelType w:val="hybridMultilevel"/>
     <w:tmpl w:val="DAD2354E"/>
@@ -1592,7 +2554,305 @@
       </w:rPr>
     </w:lvl>
   </w:abstractNum>
-  <w:abstractNum w:abstractNumId="4" w15:restartNumberingAfterBreak="0">
+  <w:abstractNum w:abstractNumId="6" w15:restartNumberingAfterBreak="0">
+    <w:nsid w:val="290B416C"/>
+    <w:multiLevelType w:val="multilevel"/>
+    <w:tmpl w:val="0F0CB984"/>
+    <w:lvl w:ilvl="0">
+      <w:start w:val="1"/>
+      <w:numFmt w:val="bullet"/>
+      <w:lvlText w:val=""/>
+      <w:lvlJc w:val="left"/>
+      <w:pPr>
+        <w:tabs>
+          <w:tab w:val="num" w:pos="720"/>
+        </w:tabs>
+        <w:ind w:left="720" w:hanging="360"/>
+      </w:pPr>
+      <w:rPr>
+        <w:rFonts w:ascii="Symbol" w:hAnsi="Symbol" w:hint="default"/>
+        <w:sz w:val="20"/>
+      </w:rPr>
+    </w:lvl>
+    <w:lvl w:ilvl="1" w:tentative="1">
+      <w:start w:val="1"/>
+      <w:numFmt w:val="bullet"/>
+      <w:lvlText w:val="o"/>
+      <w:lvlJc w:val="left"/>
+      <w:pPr>
+        <w:tabs>
+          <w:tab w:val="num" w:pos="1440"/>
+        </w:tabs>
+        <w:ind w:left="1440" w:hanging="360"/>
+      </w:pPr>
+      <w:rPr>
+        <w:rFonts w:ascii="Courier New" w:hAnsi="Courier New" w:hint="default"/>
+        <w:sz w:val="20"/>
+      </w:rPr>
+    </w:lvl>
+    <w:lvl w:ilvl="2" w:tentative="1">
+      <w:start w:val="1"/>
+      <w:numFmt w:val="bullet"/>
+      <w:lvlText w:val=""/>
+      <w:lvlJc w:val="left"/>
+      <w:pPr>
+        <w:tabs>
+          <w:tab w:val="num" w:pos="2160"/>
+        </w:tabs>
+        <w:ind w:left="2160" w:hanging="360"/>
+      </w:pPr>
+      <w:rPr>
+        <w:rFonts w:ascii="Wingdings" w:hAnsi="Wingdings" w:hint="default"/>
+        <w:sz w:val="20"/>
+      </w:rPr>
+    </w:lvl>
+    <w:lvl w:ilvl="3" w:tentative="1">
+      <w:start w:val="1"/>
+      <w:numFmt w:val="bullet"/>
+      <w:lvlText w:val=""/>
+      <w:lvlJc w:val="left"/>
+      <w:pPr>
+        <w:tabs>
+          <w:tab w:val="num" w:pos="2880"/>
+        </w:tabs>
+        <w:ind w:left="2880" w:hanging="360"/>
+      </w:pPr>
+      <w:rPr>
+        <w:rFonts w:ascii="Wingdings" w:hAnsi="Wingdings" w:hint="default"/>
+        <w:sz w:val="20"/>
+      </w:rPr>
+    </w:lvl>
+    <w:lvl w:ilvl="4" w:tentative="1">
+      <w:start w:val="1"/>
+      <w:numFmt w:val="bullet"/>
+      <w:lvlText w:val=""/>
+      <w:lvlJc w:val="left"/>
+      <w:pPr>
+        <w:tabs>
+          <w:tab w:val="num" w:pos="3600"/>
+        </w:tabs>
+        <w:ind w:left="3600" w:hanging="360"/>
+      </w:pPr>
+      <w:rPr>
+        <w:rFonts w:ascii="Wingdings" w:hAnsi="Wingdings" w:hint="default"/>
+        <w:sz w:val="20"/>
+      </w:rPr>
+    </w:lvl>
+    <w:lvl w:ilvl="5" w:tentative="1">
+      <w:start w:val="1"/>
+      <w:numFmt w:val="bullet"/>
+      <w:lvlText w:val=""/>
+      <w:lvlJc w:val="left"/>
+      <w:pPr>
+        <w:tabs>
+          <w:tab w:val="num" w:pos="4320"/>
+        </w:tabs>
+        <w:ind w:left="4320" w:hanging="360"/>
+      </w:pPr>
+      <w:rPr>
+        <w:rFonts w:ascii="Wingdings" w:hAnsi="Wingdings" w:hint="default"/>
+        <w:sz w:val="20"/>
+      </w:rPr>
+    </w:lvl>
+    <w:lvl w:ilvl="6" w:tentative="1">
+      <w:start w:val="1"/>
+      <w:numFmt w:val="bullet"/>
+      <w:lvlText w:val=""/>
+      <w:lvlJc w:val="left"/>
+      <w:pPr>
+        <w:tabs>
+          <w:tab w:val="num" w:pos="5040"/>
+        </w:tabs>
+        <w:ind w:left="5040" w:hanging="360"/>
+      </w:pPr>
+      <w:rPr>
+        <w:rFonts w:ascii="Wingdings" w:hAnsi="Wingdings" w:hint="default"/>
+        <w:sz w:val="20"/>
+      </w:rPr>
+    </w:lvl>
+    <w:lvl w:ilvl="7" w:tentative="1">
+      <w:start w:val="1"/>
+      <w:numFmt w:val="bullet"/>
+      <w:lvlText w:val=""/>
+      <w:lvlJc w:val="left"/>
+      <w:pPr>
+        <w:tabs>
+          <w:tab w:val="num" w:pos="5760"/>
+        </w:tabs>
+        <w:ind w:left="5760" w:hanging="360"/>
+      </w:pPr>
+      <w:rPr>
+        <w:rFonts w:ascii="Wingdings" w:hAnsi="Wingdings" w:hint="default"/>
+        <w:sz w:val="20"/>
+      </w:rPr>
+    </w:lvl>
+    <w:lvl w:ilvl="8" w:tentative="1">
+      <w:start w:val="1"/>
+      <w:numFmt w:val="bullet"/>
+      <w:lvlText w:val=""/>
+      <w:lvlJc w:val="left"/>
+      <w:pPr>
+        <w:tabs>
+          <w:tab w:val="num" w:pos="6480"/>
+        </w:tabs>
+        <w:ind w:left="6480" w:hanging="360"/>
+      </w:pPr>
+      <w:rPr>
+        <w:rFonts w:ascii="Wingdings" w:hAnsi="Wingdings" w:hint="default"/>
+        <w:sz w:val="20"/>
+      </w:rPr>
+    </w:lvl>
+  </w:abstractNum>
+  <w:abstractNum w:abstractNumId="7" w15:restartNumberingAfterBreak="0">
+    <w:nsid w:val="37E21640"/>
+    <w:multiLevelType w:val="multilevel"/>
+    <w:tmpl w:val="87846138"/>
+    <w:lvl w:ilvl="0">
+      <w:start w:val="1"/>
+      <w:numFmt w:val="bullet"/>
+      <w:lvlText w:val=""/>
+      <w:lvlJc w:val="left"/>
+      <w:pPr>
+        <w:tabs>
+          <w:tab w:val="num" w:pos="720"/>
+        </w:tabs>
+        <w:ind w:left="720" w:hanging="360"/>
+      </w:pPr>
+      <w:rPr>
+        <w:rFonts w:ascii="Symbol" w:hAnsi="Symbol" w:hint="default"/>
+        <w:sz w:val="20"/>
+      </w:rPr>
+    </w:lvl>
+    <w:lvl w:ilvl="1">
+      <w:start w:val="1"/>
+      <w:numFmt w:val="bullet"/>
+      <w:lvlText w:val="o"/>
+      <w:lvlJc w:val="left"/>
+      <w:pPr>
+        <w:tabs>
+          <w:tab w:val="num" w:pos="1440"/>
+        </w:tabs>
+        <w:ind w:left="1440" w:hanging="360"/>
+      </w:pPr>
+      <w:rPr>
+        <w:rFonts w:ascii="Courier New" w:hAnsi="Courier New" w:hint="default"/>
+        <w:sz w:val="20"/>
+      </w:rPr>
+    </w:lvl>
+    <w:lvl w:ilvl="2" w:tentative="1">
+      <w:start w:val="1"/>
+      <w:numFmt w:val="bullet"/>
+      <w:lvlText w:val=""/>
+      <w:lvlJc w:val="left"/>
+      <w:pPr>
+        <w:tabs>
+          <w:tab w:val="num" w:pos="2160"/>
+        </w:tabs>
+        <w:ind w:left="2160" w:hanging="360"/>
+      </w:pPr>
+      <w:rPr>
+        <w:rFonts w:ascii="Wingdings" w:hAnsi="Wingdings" w:hint="default"/>
+        <w:sz w:val="20"/>
+      </w:rPr>
+    </w:lvl>
+    <w:lvl w:ilvl="3" w:tentative="1">
+      <w:start w:val="1"/>
+      <w:numFmt w:val="bullet"/>
+      <w:lvlText w:val=""/>
+      <w:lvlJc w:val="left"/>
+      <w:pPr>
+        <w:tabs>
+          <w:tab w:val="num" w:pos="2880"/>
+        </w:tabs>
+        <w:ind w:left="2880" w:hanging="360"/>
+      </w:pPr>
+      <w:rPr>
+        <w:rFonts w:ascii="Wingdings" w:hAnsi="Wingdings" w:hint="default"/>
+        <w:sz w:val="20"/>
+      </w:rPr>
+    </w:lvl>
+    <w:lvl w:ilvl="4" w:tentative="1">
+      <w:start w:val="1"/>
+      <w:numFmt w:val="bullet"/>
+      <w:lvlText w:val=""/>
+      <w:lvlJc w:val="left"/>
+      <w:pPr>
+        <w:tabs>
+          <w:tab w:val="num" w:pos="3600"/>
+        </w:tabs>
+        <w:ind w:left="3600" w:hanging="360"/>
+      </w:pPr>
+      <w:rPr>
+        <w:rFonts w:ascii="Wingdings" w:hAnsi="Wingdings" w:hint="default"/>
+        <w:sz w:val="20"/>
+      </w:rPr>
+    </w:lvl>
+    <w:lvl w:ilvl="5" w:tentative="1">
+      <w:start w:val="1"/>
+      <w:numFmt w:val="bullet"/>
+      <w:lvlText w:val=""/>
+      <w:lvlJc w:val="left"/>
+      <w:pPr>
+        <w:tabs>
+          <w:tab w:val="num" w:pos="4320"/>
+        </w:tabs>
+        <w:ind w:left="4320" w:hanging="360"/>
+      </w:pPr>
+      <w:rPr>
+        <w:rFonts w:ascii="Wingdings" w:hAnsi="Wingdings" w:hint="default"/>
+        <w:sz w:val="20"/>
+      </w:rPr>
+    </w:lvl>
+    <w:lvl w:ilvl="6" w:tentative="1">
+      <w:start w:val="1"/>
+      <w:numFmt w:val="bullet"/>
+      <w:lvlText w:val=""/>
+      <w:lvlJc w:val="left"/>
+      <w:pPr>
+        <w:tabs>
+          <w:tab w:val="num" w:pos="5040"/>
+        </w:tabs>
+        <w:ind w:left="5040" w:hanging="360"/>
+      </w:pPr>
+      <w:rPr>
+        <w:rFonts w:ascii="Wingdings" w:hAnsi="Wingdings" w:hint="default"/>
+        <w:sz w:val="20"/>
+      </w:rPr>
+    </w:lvl>
+    <w:lvl w:ilvl="7" w:tentative="1">
+      <w:start w:val="1"/>
+      <w:numFmt w:val="bullet"/>
+      <w:lvlText w:val=""/>
+      <w:lvlJc w:val="left"/>
+      <w:pPr>
+        <w:tabs>
+          <w:tab w:val="num" w:pos="5760"/>
+        </w:tabs>
+        <w:ind w:left="5760" w:hanging="360"/>
+      </w:pPr>
+      <w:rPr>
+        <w:rFonts w:ascii="Wingdings" w:hAnsi="Wingdings" w:hint="default"/>
+        <w:sz w:val="20"/>
+      </w:rPr>
+    </w:lvl>
+    <w:lvl w:ilvl="8" w:tentative="1">
+      <w:start w:val="1"/>
+      <w:numFmt w:val="bullet"/>
+      <w:lvlText w:val=""/>
+      <w:lvlJc w:val="left"/>
+      <w:pPr>
+        <w:tabs>
+          <w:tab w:val="num" w:pos="6480"/>
+        </w:tabs>
+        <w:ind w:left="6480" w:hanging="360"/>
+      </w:pPr>
+      <w:rPr>
+        <w:rFonts w:ascii="Wingdings" w:hAnsi="Wingdings" w:hint="default"/>
+        <w:sz w:val="20"/>
+      </w:rPr>
+    </w:lvl>
+  </w:abstractNum>
+  <w:abstractNum w:abstractNumId="8" w15:restartNumberingAfterBreak="0">
     <w:nsid w:val="3D9F3780"/>
     <w:multiLevelType w:val="hybridMultilevel"/>
     <w:tmpl w:val="DE48302A"/>
@@ -1705,7 +2965,7 @@
       </w:rPr>
     </w:lvl>
   </w:abstractNum>
-  <w:abstractNum w:abstractNumId="5" w15:restartNumberingAfterBreak="0">
+  <w:abstractNum w:abstractNumId="9" w15:restartNumberingAfterBreak="0">
     <w:nsid w:val="43740D7A"/>
     <w:multiLevelType w:val="hybridMultilevel"/>
     <w:tmpl w:val="5FFC9A16"/>
@@ -1818,7 +3078,156 @@
       </w:rPr>
     </w:lvl>
   </w:abstractNum>
-  <w:abstractNum w:abstractNumId="6" w15:restartNumberingAfterBreak="0">
+  <w:abstractNum w:abstractNumId="10" w15:restartNumberingAfterBreak="0">
+    <w:nsid w:val="49F864EF"/>
+    <w:multiLevelType w:val="multilevel"/>
+    <w:tmpl w:val="DF64C23A"/>
+    <w:lvl w:ilvl="0">
+      <w:start w:val="1"/>
+      <w:numFmt w:val="bullet"/>
+      <w:lvlText w:val=""/>
+      <w:lvlJc w:val="left"/>
+      <w:pPr>
+        <w:tabs>
+          <w:tab w:val="num" w:pos="720"/>
+        </w:tabs>
+        <w:ind w:left="720" w:hanging="360"/>
+      </w:pPr>
+      <w:rPr>
+        <w:rFonts w:ascii="Symbol" w:hAnsi="Symbol" w:hint="default"/>
+        <w:sz w:val="20"/>
+      </w:rPr>
+    </w:lvl>
+    <w:lvl w:ilvl="1" w:tentative="1">
+      <w:start w:val="1"/>
+      <w:numFmt w:val="bullet"/>
+      <w:lvlText w:val="o"/>
+      <w:lvlJc w:val="left"/>
+      <w:pPr>
+        <w:tabs>
+          <w:tab w:val="num" w:pos="1440"/>
+        </w:tabs>
+        <w:ind w:left="1440" w:hanging="360"/>
+      </w:pPr>
+      <w:rPr>
+        <w:rFonts w:ascii="Courier New" w:hAnsi="Courier New" w:hint="default"/>
+        <w:sz w:val="20"/>
+      </w:rPr>
+    </w:lvl>
+    <w:lvl w:ilvl="2" w:tentative="1">
+      <w:start w:val="1"/>
+      <w:numFmt w:val="bullet"/>
+      <w:lvlText w:val=""/>
+      <w:lvlJc w:val="left"/>
+      <w:pPr>
+        <w:tabs>
+          <w:tab w:val="num" w:pos="2160"/>
+        </w:tabs>
+        <w:ind w:left="2160" w:hanging="360"/>
+      </w:pPr>
+      <w:rPr>
+        <w:rFonts w:ascii="Wingdings" w:hAnsi="Wingdings" w:hint="default"/>
+        <w:sz w:val="20"/>
+      </w:rPr>
+    </w:lvl>
+    <w:lvl w:ilvl="3" w:tentative="1">
+      <w:start w:val="1"/>
+      <w:numFmt w:val="bullet"/>
+      <w:lvlText w:val=""/>
+      <w:lvlJc w:val="left"/>
+      <w:pPr>
+        <w:tabs>
+          <w:tab w:val="num" w:pos="2880"/>
+        </w:tabs>
+        <w:ind w:left="2880" w:hanging="360"/>
+      </w:pPr>
+      <w:rPr>
+        <w:rFonts w:ascii="Wingdings" w:hAnsi="Wingdings" w:hint="default"/>
+        <w:sz w:val="20"/>
+      </w:rPr>
+    </w:lvl>
+    <w:lvl w:ilvl="4" w:tentative="1">
+      <w:start w:val="1"/>
+      <w:numFmt w:val="bullet"/>
+      <w:lvlText w:val=""/>
+      <w:lvlJc w:val="left"/>
+      <w:pPr>
+        <w:tabs>
+          <w:tab w:val="num" w:pos="3600"/>
+        </w:tabs>
+        <w:ind w:left="3600" w:hanging="360"/>
+      </w:pPr>
+      <w:rPr>
+        <w:rFonts w:ascii="Wingdings" w:hAnsi="Wingdings" w:hint="default"/>
+        <w:sz w:val="20"/>
+      </w:rPr>
+    </w:lvl>
+    <w:lvl w:ilvl="5" w:tentative="1">
+      <w:start w:val="1"/>
+      <w:numFmt w:val="bullet"/>
+      <w:lvlText w:val=""/>
+      <w:lvlJc w:val="left"/>
+      <w:pPr>
+        <w:tabs>
+          <w:tab w:val="num" w:pos="4320"/>
+        </w:tabs>
+        <w:ind w:left="4320" w:hanging="360"/>
+      </w:pPr>
+      <w:rPr>
+        <w:rFonts w:ascii="Wingdings" w:hAnsi="Wingdings" w:hint="default"/>
+        <w:sz w:val="20"/>
+      </w:rPr>
+    </w:lvl>
+    <w:lvl w:ilvl="6" w:tentative="1">
+      <w:start w:val="1"/>
+      <w:numFmt w:val="bullet"/>
+      <w:lvlText w:val=""/>
+      <w:lvlJc w:val="left"/>
+      <w:pPr>
+        <w:tabs>
+          <w:tab w:val="num" w:pos="5040"/>
+        </w:tabs>
+        <w:ind w:left="5040" w:hanging="360"/>
+      </w:pPr>
+      <w:rPr>
+        <w:rFonts w:ascii="Wingdings" w:hAnsi="Wingdings" w:hint="default"/>
+        <w:sz w:val="20"/>
+      </w:rPr>
+    </w:lvl>
+    <w:lvl w:ilvl="7" w:tentative="1">
+      <w:start w:val="1"/>
+      <w:numFmt w:val="bullet"/>
+      <w:lvlText w:val=""/>
+      <w:lvlJc w:val="left"/>
+      <w:pPr>
+        <w:tabs>
+          <w:tab w:val="num" w:pos="5760"/>
+        </w:tabs>
+        <w:ind w:left="5760" w:hanging="360"/>
+      </w:pPr>
+      <w:rPr>
+        <w:rFonts w:ascii="Wingdings" w:hAnsi="Wingdings" w:hint="default"/>
+        <w:sz w:val="20"/>
+      </w:rPr>
+    </w:lvl>
+    <w:lvl w:ilvl="8" w:tentative="1">
+      <w:start w:val="1"/>
+      <w:numFmt w:val="bullet"/>
+      <w:lvlText w:val=""/>
+      <w:lvlJc w:val="left"/>
+      <w:pPr>
+        <w:tabs>
+          <w:tab w:val="num" w:pos="6480"/>
+        </w:tabs>
+        <w:ind w:left="6480" w:hanging="360"/>
+      </w:pPr>
+      <w:rPr>
+        <w:rFonts w:ascii="Wingdings" w:hAnsi="Wingdings" w:hint="default"/>
+        <w:sz w:val="20"/>
+      </w:rPr>
+    </w:lvl>
+  </w:abstractNum>
+  <w:abstractNum w:abstractNumId="11" w15:restartNumberingAfterBreak="0">
     <w:nsid w:val="627E41D3"/>
     <w:multiLevelType w:val="multilevel"/>
     <w:tmpl w:val="DDD6FB9E"/>
@@ -1967,7 +3376,7 @@
       </w:rPr>
     </w:lvl>
   </w:abstractNum>
-  <w:abstractNum w:abstractNumId="7" w15:restartNumberingAfterBreak="0">
+  <w:abstractNum w:abstractNumId="12" w15:restartNumberingAfterBreak="0">
     <w:nsid w:val="69B05579"/>
     <w:multiLevelType w:val="multilevel"/>
     <w:tmpl w:val="85080810"/>
@@ -2116,7 +3525,7 @@
       </w:rPr>
     </w:lvl>
   </w:abstractNum>
-  <w:abstractNum w:abstractNumId="8" w15:restartNumberingAfterBreak="0">
+  <w:abstractNum w:abstractNumId="13" w15:restartNumberingAfterBreak="0">
     <w:nsid w:val="6D440812"/>
     <w:multiLevelType w:val="hybridMultilevel"/>
     <w:tmpl w:val="E424C122"/>
@@ -2229,32 +3638,351 @@
       </w:rPr>
     </w:lvl>
   </w:abstractNum>
+  <w:abstractNum w:abstractNumId="14" w15:restartNumberingAfterBreak="0">
+    <w:nsid w:val="77666052"/>
+    <w:multiLevelType w:val="multilevel"/>
+    <w:tmpl w:val="FB5ED678"/>
+    <w:lvl w:ilvl="0">
+      <w:start w:val="1"/>
+      <w:numFmt w:val="bullet"/>
+      <w:lvlText w:val=""/>
+      <w:lvlJc w:val="left"/>
+      <w:pPr>
+        <w:tabs>
+          <w:tab w:val="num" w:pos="720"/>
+        </w:tabs>
+        <w:ind w:left="720" w:hanging="360"/>
+      </w:pPr>
+      <w:rPr>
+        <w:rFonts w:ascii="Symbol" w:hAnsi="Symbol" w:hint="default"/>
+        <w:sz w:val="20"/>
+      </w:rPr>
+    </w:lvl>
+    <w:lvl w:ilvl="1" w:tentative="1">
+      <w:start w:val="1"/>
+      <w:numFmt w:val="bullet"/>
+      <w:lvlText w:val="o"/>
+      <w:lvlJc w:val="left"/>
+      <w:pPr>
+        <w:tabs>
+          <w:tab w:val="num" w:pos="1440"/>
+        </w:tabs>
+        <w:ind w:left="1440" w:hanging="360"/>
+      </w:pPr>
+      <w:rPr>
+        <w:rFonts w:ascii="Courier New" w:hAnsi="Courier New" w:hint="default"/>
+        <w:sz w:val="20"/>
+      </w:rPr>
+    </w:lvl>
+    <w:lvl w:ilvl="2" w:tentative="1">
+      <w:start w:val="1"/>
+      <w:numFmt w:val="bullet"/>
+      <w:lvlText w:val=""/>
+      <w:lvlJc w:val="left"/>
+      <w:pPr>
+        <w:tabs>
+          <w:tab w:val="num" w:pos="2160"/>
+        </w:tabs>
+        <w:ind w:left="2160" w:hanging="360"/>
+      </w:pPr>
+      <w:rPr>
+        <w:rFonts w:ascii="Wingdings" w:hAnsi="Wingdings" w:hint="default"/>
+        <w:sz w:val="20"/>
+      </w:rPr>
+    </w:lvl>
+    <w:lvl w:ilvl="3" w:tentative="1">
+      <w:start w:val="1"/>
+      <w:numFmt w:val="bullet"/>
+      <w:lvlText w:val=""/>
+      <w:lvlJc w:val="left"/>
+      <w:pPr>
+        <w:tabs>
+          <w:tab w:val="num" w:pos="2880"/>
+        </w:tabs>
+        <w:ind w:left="2880" w:hanging="360"/>
+      </w:pPr>
+      <w:rPr>
+        <w:rFonts w:ascii="Wingdings" w:hAnsi="Wingdings" w:hint="default"/>
+        <w:sz w:val="20"/>
+      </w:rPr>
+    </w:lvl>
+    <w:lvl w:ilvl="4" w:tentative="1">
+      <w:start w:val="1"/>
+      <w:numFmt w:val="bullet"/>
+      <w:lvlText w:val=""/>
+      <w:lvlJc w:val="left"/>
+      <w:pPr>
+        <w:tabs>
+          <w:tab w:val="num" w:pos="3600"/>
+        </w:tabs>
+        <w:ind w:left="3600" w:hanging="360"/>
+      </w:pPr>
+      <w:rPr>
+        <w:rFonts w:ascii="Wingdings" w:hAnsi="Wingdings" w:hint="default"/>
+        <w:sz w:val="20"/>
+      </w:rPr>
+    </w:lvl>
+    <w:lvl w:ilvl="5" w:tentative="1">
+      <w:start w:val="1"/>
+      <w:numFmt w:val="bullet"/>
+      <w:lvlText w:val=""/>
+      <w:lvlJc w:val="left"/>
+      <w:pPr>
+        <w:tabs>
+          <w:tab w:val="num" w:pos="4320"/>
+        </w:tabs>
+        <w:ind w:left="4320" w:hanging="360"/>
+      </w:pPr>
+      <w:rPr>
+        <w:rFonts w:ascii="Wingdings" w:hAnsi="Wingdings" w:hint="default"/>
+        <w:sz w:val="20"/>
+      </w:rPr>
+    </w:lvl>
+    <w:lvl w:ilvl="6" w:tentative="1">
+      <w:start w:val="1"/>
+      <w:numFmt w:val="bullet"/>
+      <w:lvlText w:val=""/>
+      <w:lvlJc w:val="left"/>
+      <w:pPr>
+        <w:tabs>
+          <w:tab w:val="num" w:pos="5040"/>
+        </w:tabs>
+        <w:ind w:left="5040" w:hanging="360"/>
+      </w:pPr>
+      <w:rPr>
+        <w:rFonts w:ascii="Wingdings" w:hAnsi="Wingdings" w:hint="default"/>
+        <w:sz w:val="20"/>
+      </w:rPr>
+    </w:lvl>
+    <w:lvl w:ilvl="7" w:tentative="1">
+      <w:start w:val="1"/>
+      <w:numFmt w:val="bullet"/>
+      <w:lvlText w:val=""/>
+      <w:lvlJc w:val="left"/>
+      <w:pPr>
+        <w:tabs>
+          <w:tab w:val="num" w:pos="5760"/>
+        </w:tabs>
+        <w:ind w:left="5760" w:hanging="360"/>
+      </w:pPr>
+      <w:rPr>
+        <w:rFonts w:ascii="Wingdings" w:hAnsi="Wingdings" w:hint="default"/>
+        <w:sz w:val="20"/>
+      </w:rPr>
+    </w:lvl>
+    <w:lvl w:ilvl="8" w:tentative="1">
+      <w:start w:val="1"/>
+      <w:numFmt w:val="bullet"/>
+      <w:lvlText w:val=""/>
+      <w:lvlJc w:val="left"/>
+      <w:pPr>
+        <w:tabs>
+          <w:tab w:val="num" w:pos="6480"/>
+        </w:tabs>
+        <w:ind w:left="6480" w:hanging="360"/>
+      </w:pPr>
+      <w:rPr>
+        <w:rFonts w:ascii="Wingdings" w:hAnsi="Wingdings" w:hint="default"/>
+        <w:sz w:val="20"/>
+      </w:rPr>
+    </w:lvl>
+  </w:abstractNum>
+  <w:abstractNum w:abstractNumId="15" w15:restartNumberingAfterBreak="0">
+    <w:nsid w:val="7A457EEE"/>
+    <w:multiLevelType w:val="multilevel"/>
+    <w:tmpl w:val="AC642E5A"/>
+    <w:lvl w:ilvl="0">
+      <w:start w:val="1"/>
+      <w:numFmt w:val="bullet"/>
+      <w:lvlText w:val=""/>
+      <w:lvlJc w:val="left"/>
+      <w:pPr>
+        <w:tabs>
+          <w:tab w:val="num" w:pos="720"/>
+        </w:tabs>
+        <w:ind w:left="720" w:hanging="360"/>
+      </w:pPr>
+      <w:rPr>
+        <w:rFonts w:ascii="Symbol" w:hAnsi="Symbol" w:hint="default"/>
+        <w:sz w:val="20"/>
+      </w:rPr>
+    </w:lvl>
+    <w:lvl w:ilvl="1" w:tentative="1">
+      <w:start w:val="1"/>
+      <w:numFmt w:val="bullet"/>
+      <w:lvlText w:val="o"/>
+      <w:lvlJc w:val="left"/>
+      <w:pPr>
+        <w:tabs>
+          <w:tab w:val="num" w:pos="1440"/>
+        </w:tabs>
+        <w:ind w:left="1440" w:hanging="360"/>
+      </w:pPr>
+      <w:rPr>
+        <w:rFonts w:ascii="Courier New" w:hAnsi="Courier New" w:hint="default"/>
+        <w:sz w:val="20"/>
+      </w:rPr>
+    </w:lvl>
+    <w:lvl w:ilvl="2" w:tentative="1">
+      <w:start w:val="1"/>
+      <w:numFmt w:val="bullet"/>
+      <w:lvlText w:val=""/>
+      <w:lvlJc w:val="left"/>
+      <w:pPr>
+        <w:tabs>
+          <w:tab w:val="num" w:pos="2160"/>
+        </w:tabs>
+        <w:ind w:left="2160" w:hanging="360"/>
+      </w:pPr>
+      <w:rPr>
+        <w:rFonts w:ascii="Wingdings" w:hAnsi="Wingdings" w:hint="default"/>
+        <w:sz w:val="20"/>
+      </w:rPr>
+    </w:lvl>
+    <w:lvl w:ilvl="3" w:tentative="1">
+      <w:start w:val="1"/>
+      <w:numFmt w:val="bullet"/>
+      <w:lvlText w:val=""/>
+      <w:lvlJc w:val="left"/>
+      <w:pPr>
+        <w:tabs>
+          <w:tab w:val="num" w:pos="2880"/>
+        </w:tabs>
+        <w:ind w:left="2880" w:hanging="360"/>
+      </w:pPr>
+      <w:rPr>
+        <w:rFonts w:ascii="Wingdings" w:hAnsi="Wingdings" w:hint="default"/>
+        <w:sz w:val="20"/>
+      </w:rPr>
+    </w:lvl>
+    <w:lvl w:ilvl="4" w:tentative="1">
+      <w:start w:val="1"/>
+      <w:numFmt w:val="bullet"/>
+      <w:lvlText w:val=""/>
+      <w:lvlJc w:val="left"/>
+      <w:pPr>
+        <w:tabs>
+          <w:tab w:val="num" w:pos="3600"/>
+        </w:tabs>
+        <w:ind w:left="3600" w:hanging="360"/>
+      </w:pPr>
+      <w:rPr>
+        <w:rFonts w:ascii="Wingdings" w:hAnsi="Wingdings" w:hint="default"/>
+        <w:sz w:val="20"/>
+      </w:rPr>
+    </w:lvl>
+    <w:lvl w:ilvl="5" w:tentative="1">
+      <w:start w:val="1"/>
+      <w:numFmt w:val="bullet"/>
+      <w:lvlText w:val=""/>
+      <w:lvlJc w:val="left"/>
+      <w:pPr>
+        <w:tabs>
+          <w:tab w:val="num" w:pos="4320"/>
+        </w:tabs>
+        <w:ind w:left="4320" w:hanging="360"/>
+      </w:pPr>
+      <w:rPr>
+        <w:rFonts w:ascii="Wingdings" w:hAnsi="Wingdings" w:hint="default"/>
+        <w:sz w:val="20"/>
+      </w:rPr>
+    </w:lvl>
+    <w:lvl w:ilvl="6" w:tentative="1">
+      <w:start w:val="1"/>
+      <w:numFmt w:val="bullet"/>
+      <w:lvlText w:val=""/>
+      <w:lvlJc w:val="left"/>
+      <w:pPr>
+        <w:tabs>
+          <w:tab w:val="num" w:pos="5040"/>
+        </w:tabs>
+        <w:ind w:left="5040" w:hanging="360"/>
+      </w:pPr>
+      <w:rPr>
+        <w:rFonts w:ascii="Wingdings" w:hAnsi="Wingdings" w:hint="default"/>
+        <w:sz w:val="20"/>
+      </w:rPr>
+    </w:lvl>
+    <w:lvl w:ilvl="7" w:tentative="1">
+      <w:start w:val="1"/>
+      <w:numFmt w:val="bullet"/>
+      <w:lvlText w:val=""/>
+      <w:lvlJc w:val="left"/>
+      <w:pPr>
+        <w:tabs>
+          <w:tab w:val="num" w:pos="5760"/>
+        </w:tabs>
+        <w:ind w:left="5760" w:hanging="360"/>
+      </w:pPr>
+      <w:rPr>
+        <w:rFonts w:ascii="Wingdings" w:hAnsi="Wingdings" w:hint="default"/>
+        <w:sz w:val="20"/>
+      </w:rPr>
+    </w:lvl>
+    <w:lvl w:ilvl="8" w:tentative="1">
+      <w:start w:val="1"/>
+      <w:numFmt w:val="bullet"/>
+      <w:lvlText w:val=""/>
+      <w:lvlJc w:val="left"/>
+      <w:pPr>
+        <w:tabs>
+          <w:tab w:val="num" w:pos="6480"/>
+        </w:tabs>
+        <w:ind w:left="6480" w:hanging="360"/>
+      </w:pPr>
+      <w:rPr>
+        <w:rFonts w:ascii="Wingdings" w:hAnsi="Wingdings" w:hint="default"/>
+        <w:sz w:val="20"/>
+      </w:rPr>
+    </w:lvl>
+  </w:abstractNum>
   <w:num w:numId="1" w16cid:durableId="331108783">
+    <w:abstractNumId w:val="13"/>
+  </w:num>
+  <w:num w:numId="2" w16cid:durableId="1130709641">
+    <w:abstractNumId w:val="11"/>
+  </w:num>
+  <w:num w:numId="3" w16cid:durableId="166945493">
+    <w:abstractNumId w:val="9"/>
+  </w:num>
+  <w:num w:numId="4" w16cid:durableId="224487291">
+    <w:abstractNumId w:val="5"/>
+  </w:num>
+  <w:num w:numId="5" w16cid:durableId="1843812225">
+    <w:abstractNumId w:val="3"/>
+  </w:num>
+  <w:num w:numId="6" w16cid:durableId="1678383529">
+    <w:abstractNumId w:val="4"/>
+  </w:num>
+  <w:num w:numId="7" w16cid:durableId="32922541">
     <w:abstractNumId w:val="8"/>
   </w:num>
-  <w:num w:numId="2" w16cid:durableId="1130709641">
-    <w:abstractNumId w:val="6"/>
-  </w:num>
-  <w:num w:numId="3" w16cid:durableId="166945493">
-    <w:abstractNumId w:val="5"/>
-  </w:num>
-  <w:num w:numId="4" w16cid:durableId="224487291">
-    <w:abstractNumId w:val="3"/>
-  </w:num>
-  <w:num w:numId="5" w16cid:durableId="1843812225">
-    <w:abstractNumId w:val="1"/>
-  </w:num>
-  <w:num w:numId="6" w16cid:durableId="1678383529">
-    <w:abstractNumId w:val="2"/>
-  </w:num>
-  <w:num w:numId="7" w16cid:durableId="32922541">
-    <w:abstractNumId w:val="4"/>
-  </w:num>
   <w:num w:numId="8" w16cid:durableId="1238321735">
-    <w:abstractNumId w:val="7"/>
+    <w:abstractNumId w:val="12"/>
   </w:num>
   <w:num w:numId="9" w16cid:durableId="840240615">
     <w:abstractNumId w:val="0"/>
+  </w:num>
+  <w:num w:numId="10" w16cid:durableId="749349220">
+    <w:abstractNumId w:val="14"/>
+  </w:num>
+  <w:num w:numId="11" w16cid:durableId="808133966">
+    <w:abstractNumId w:val="1"/>
+  </w:num>
+  <w:num w:numId="12" w16cid:durableId="1899978395">
+    <w:abstractNumId w:val="10"/>
+  </w:num>
+  <w:num w:numId="13" w16cid:durableId="430012774">
+    <w:abstractNumId w:val="7"/>
+  </w:num>
+  <w:num w:numId="14" w16cid:durableId="1668557002">
+    <w:abstractNumId w:val="2"/>
+  </w:num>
+  <w:num w:numId="15" w16cid:durableId="1478187688">
+    <w:abstractNumId w:val="15"/>
+  </w:num>
+  <w:num w:numId="16" w16cid:durableId="1437018510">
+    <w:abstractNumId w:val="6"/>
   </w:num>
 </w:numbering>
 </file>

</xml_diff>